<commit_message>
docs: update lab 4 report
</commit_message>
<xml_diff>
--- a/report/Отчет_ЛР4.docx
+++ b/report/Отчет_ЛР4.docx
@@ -297,7 +297,7 @@
       <w:r>
         <w:fldChar w:fldCharType="separate"/>
       </w:r>
-      <w:hyperlink w:anchor="_Toc242378551" w:history="1">
+      <w:hyperlink w:anchor="_Toc242385935" w:history="1">
         <w:r>
           <w:rPr>
             <w:rStyle w:val="aff8"/>
@@ -324,7 +324,7 @@
             <w:noProof/>
             <w:webHidden/>
           </w:rPr>
-          <w:instrText xml:space="preserve"> PAGEREF _Toc242378551 \h </w:instrText>
+          <w:instrText xml:space="preserve"> PAGEREF _Toc242385935 \h </w:instrText>
         </w:r>
         <w:r>
           <w:rPr>
@@ -370,7 +370,7 @@
           <w14:ligatures w14:val="standardContextual"/>
         </w:rPr>
       </w:pPr>
-      <w:hyperlink w:anchor="_Toc242378552" w:history="1">
+      <w:hyperlink w:anchor="_Toc242385936" w:history="1">
         <w:r>
           <w:rPr>
             <w:rStyle w:val="aff8"/>
@@ -397,7 +397,7 @@
             <w:noProof/>
             <w:webHidden/>
           </w:rPr>
-          <w:instrText xml:space="preserve"> PAGEREF _Toc242378552 \h </w:instrText>
+          <w:instrText xml:space="preserve"> PAGEREF _Toc242385936 \h </w:instrText>
         </w:r>
         <w:r>
           <w:rPr>
@@ -443,7 +443,7 @@
           <w14:ligatures w14:val="standardContextual"/>
         </w:rPr>
       </w:pPr>
-      <w:hyperlink w:anchor="_Toc242378553" w:history="1">
+      <w:hyperlink w:anchor="_Toc242385937" w:history="1">
         <w:r>
           <w:rPr>
             <w:rStyle w:val="aff8"/>
@@ -470,7 +470,7 @@
             <w:noProof/>
             <w:webHidden/>
           </w:rPr>
-          <w:instrText xml:space="preserve"> PAGEREF _Toc242378553 \h </w:instrText>
+          <w:instrText xml:space="preserve"> PAGEREF _Toc242385937 \h </w:instrText>
         </w:r>
         <w:r>
           <w:rPr>
@@ -516,7 +516,7 @@
           <w14:ligatures w14:val="standardContextual"/>
         </w:rPr>
       </w:pPr>
-      <w:hyperlink w:anchor="_Toc242378554" w:history="1">
+      <w:hyperlink w:anchor="_Toc242385938" w:history="1">
         <w:r>
           <w:rPr>
             <w:rStyle w:val="aff8"/>
@@ -543,7 +543,7 @@
             <w:noProof/>
             <w:webHidden/>
           </w:rPr>
-          <w:instrText xml:space="preserve"> PAGEREF _Toc242378554 \h </w:instrText>
+          <w:instrText xml:space="preserve"> PAGEREF _Toc242385938 \h </w:instrText>
         </w:r>
         <w:r>
           <w:rPr>
@@ -589,7 +589,7 @@
           <w14:ligatures w14:val="standardContextual"/>
         </w:rPr>
       </w:pPr>
-      <w:hyperlink w:anchor="_Toc242378555" w:history="1">
+      <w:hyperlink w:anchor="_Toc242385939" w:history="1">
         <w:r>
           <w:rPr>
             <w:rStyle w:val="aff8"/>
@@ -616,7 +616,7 @@
             <w:noProof/>
             <w:webHidden/>
           </w:rPr>
-          <w:instrText xml:space="preserve"> PAGEREF _Toc242378555 \h </w:instrText>
+          <w:instrText xml:space="preserve"> PAGEREF _Toc242385939 \h </w:instrText>
         </w:r>
         <w:r>
           <w:rPr>
@@ -662,7 +662,7 @@
           <w14:ligatures w14:val="standardContextual"/>
         </w:rPr>
       </w:pPr>
-      <w:hyperlink w:anchor="_Toc242378556" w:history="1">
+      <w:hyperlink w:anchor="_Toc242385940" w:history="1">
         <w:r>
           <w:rPr>
             <w:rStyle w:val="aff8"/>
@@ -689,7 +689,7 @@
             <w:noProof/>
             <w:webHidden/>
           </w:rPr>
-          <w:instrText xml:space="preserve"> PAGEREF _Toc242378556 \h </w:instrText>
+          <w:instrText xml:space="preserve"> PAGEREF _Toc242385940 \h </w:instrText>
         </w:r>
         <w:r>
           <w:rPr>
@@ -735,7 +735,7 @@
           <w14:ligatures w14:val="standardContextual"/>
         </w:rPr>
       </w:pPr>
-      <w:hyperlink w:anchor="_Toc242378557" w:history="1">
+      <w:hyperlink w:anchor="_Toc242385941" w:history="1">
         <w:r>
           <w:rPr>
             <w:rStyle w:val="aff8"/>
@@ -770,7 +770,7 @@
             <w:noProof/>
             <w:webHidden/>
           </w:rPr>
-          <w:instrText xml:space="preserve"> PAGEREF _Toc242378557 \h </w:instrText>
+          <w:instrText xml:space="preserve"> PAGEREF _Toc242385941 \h </w:instrText>
         </w:r>
         <w:r>
           <w:rPr>
@@ -816,7 +816,7 @@
           <w14:ligatures w14:val="standardContextual"/>
         </w:rPr>
       </w:pPr>
-      <w:hyperlink w:anchor="_Toc242378558" w:history="1">
+      <w:hyperlink w:anchor="_Toc242385942" w:history="1">
         <w:r>
           <w:rPr>
             <w:rStyle w:val="aff8"/>
@@ -843,7 +843,7 @@
             <w:noProof/>
             <w:webHidden/>
           </w:rPr>
-          <w:instrText xml:space="preserve"> PAGEREF _Toc242378558 \h </w:instrText>
+          <w:instrText xml:space="preserve"> PAGEREF _Toc242385942 \h </w:instrText>
         </w:r>
         <w:r>
           <w:rPr>
@@ -889,7 +889,7 @@
           <w14:ligatures w14:val="standardContextual"/>
         </w:rPr>
       </w:pPr>
-      <w:hyperlink w:anchor="_Toc242378559" w:history="1">
+      <w:hyperlink w:anchor="_Toc242385943" w:history="1">
         <w:r>
           <w:rPr>
             <w:rStyle w:val="aff8"/>
@@ -916,7 +916,7 @@
             <w:noProof/>
             <w:webHidden/>
           </w:rPr>
-          <w:instrText xml:space="preserve"> PAGEREF _Toc242378559 \h </w:instrText>
+          <w:instrText xml:space="preserve"> PAGEREF _Toc242385943 \h </w:instrText>
         </w:r>
         <w:r>
           <w:rPr>
@@ -962,7 +962,7 @@
           <w14:ligatures w14:val="standardContextual"/>
         </w:rPr>
       </w:pPr>
-      <w:hyperlink w:anchor="_Toc242378560" w:history="1">
+      <w:hyperlink w:anchor="_Toc242385944" w:history="1">
         <w:r>
           <w:rPr>
             <w:rStyle w:val="aff8"/>
@@ -1004,7 +1004,7 @@
             <w:noProof/>
             <w:webHidden/>
           </w:rPr>
-          <w:instrText xml:space="preserve"> PAGEREF _Toc242378560 \h </w:instrText>
+          <w:instrText xml:space="preserve"> PAGEREF _Toc242385944 \h </w:instrText>
         </w:r>
         <w:r>
           <w:rPr>
@@ -1050,7 +1050,7 @@
           <w14:ligatures w14:val="standardContextual"/>
         </w:rPr>
       </w:pPr>
-      <w:hyperlink w:anchor="_Toc242378561" w:history="1">
+      <w:hyperlink w:anchor="_Toc242385945" w:history="1">
         <w:r>
           <w:rPr>
             <w:rStyle w:val="aff8"/>
@@ -1077,7 +1077,7 @@
             <w:noProof/>
             <w:webHidden/>
           </w:rPr>
-          <w:instrText xml:space="preserve"> PAGEREF _Toc242378561 \h </w:instrText>
+          <w:instrText xml:space="preserve"> PAGEREF _Toc242385945 \h </w:instrText>
         </w:r>
         <w:r>
           <w:rPr>
@@ -1123,7 +1123,7 @@
           <w14:ligatures w14:val="standardContextual"/>
         </w:rPr>
       </w:pPr>
-      <w:hyperlink w:anchor="_Toc242378562" w:history="1">
+      <w:hyperlink w:anchor="_Toc242385946" w:history="1">
         <w:r>
           <w:rPr>
             <w:rStyle w:val="aff8"/>
@@ -1150,7 +1150,7 @@
             <w:noProof/>
             <w:webHidden/>
           </w:rPr>
-          <w:instrText xml:space="preserve"> PAGEREF _Toc242378562 \h </w:instrText>
+          <w:instrText xml:space="preserve"> PAGEREF _Toc242385946 \h </w:instrText>
         </w:r>
         <w:r>
           <w:rPr>
@@ -1196,7 +1196,7 @@
           <w14:ligatures w14:val="standardContextual"/>
         </w:rPr>
       </w:pPr>
-      <w:hyperlink w:anchor="_Toc242378563" w:history="1">
+      <w:hyperlink w:anchor="_Toc242385947" w:history="1">
         <w:r>
           <w:rPr>
             <w:rStyle w:val="aff8"/>
@@ -1223,7 +1223,7 @@
             <w:noProof/>
             <w:webHidden/>
           </w:rPr>
-          <w:instrText xml:space="preserve"> PAGEREF _Toc242378563 \h </w:instrText>
+          <w:instrText xml:space="preserve"> PAGEREF _Toc242385947 \h </w:instrText>
         </w:r>
         <w:r>
           <w:rPr>
@@ -1269,7 +1269,7 @@
           <w14:ligatures w14:val="standardContextual"/>
         </w:rPr>
       </w:pPr>
-      <w:hyperlink w:anchor="_Toc242378564" w:history="1">
+      <w:hyperlink w:anchor="_Toc242385948" w:history="1">
         <w:r>
           <w:rPr>
             <w:rStyle w:val="aff8"/>
@@ -1296,7 +1296,7 @@
             <w:noProof/>
             <w:webHidden/>
           </w:rPr>
-          <w:instrText xml:space="preserve"> PAGEREF _Toc242378564 \h </w:instrText>
+          <w:instrText xml:space="preserve"> PAGEREF _Toc242385948 \h </w:instrText>
         </w:r>
         <w:r>
           <w:rPr>
@@ -1342,7 +1342,7 @@
           <w14:ligatures w14:val="standardContextual"/>
         </w:rPr>
       </w:pPr>
-      <w:hyperlink w:anchor="_Toc242378565" w:history="1">
+      <w:hyperlink w:anchor="_Toc242385949" w:history="1">
         <w:r>
           <w:rPr>
             <w:rStyle w:val="aff8"/>
@@ -1399,7 +1399,7 @@
             <w:noProof/>
             <w:webHidden/>
           </w:rPr>
-          <w:instrText xml:space="preserve"> PAGEREF _Toc242378565 \h </w:instrText>
+          <w:instrText xml:space="preserve"> PAGEREF _Toc242385949 \h </w:instrText>
         </w:r>
         <w:r>
           <w:rPr>
@@ -1445,7 +1445,7 @@
           <w14:ligatures w14:val="standardContextual"/>
         </w:rPr>
       </w:pPr>
-      <w:hyperlink w:anchor="_Toc242378566" w:history="1">
+      <w:hyperlink w:anchor="_Toc242385950" w:history="1">
         <w:r>
           <w:rPr>
             <w:rStyle w:val="aff8"/>
@@ -1472,7 +1472,7 @@
             <w:noProof/>
             <w:webHidden/>
           </w:rPr>
-          <w:instrText xml:space="preserve"> PAGEREF _Toc242378566 \h </w:instrText>
+          <w:instrText xml:space="preserve"> PAGEREF _Toc242385950 \h </w:instrText>
         </w:r>
         <w:r>
           <w:rPr>
@@ -1518,7 +1518,7 @@
           <w14:ligatures w14:val="standardContextual"/>
         </w:rPr>
       </w:pPr>
-      <w:hyperlink w:anchor="_Toc242378567" w:history="1">
+      <w:hyperlink w:anchor="_Toc242385951" w:history="1">
         <w:r>
           <w:rPr>
             <w:rStyle w:val="aff8"/>
@@ -1545,7 +1545,7 @@
             <w:noProof/>
             <w:webHidden/>
           </w:rPr>
-          <w:instrText xml:space="preserve"> PAGEREF _Toc242378567 \h </w:instrText>
+          <w:instrText xml:space="preserve"> PAGEREF _Toc242385951 \h </w:instrText>
         </w:r>
         <w:r>
           <w:rPr>
@@ -1591,7 +1591,7 @@
         <w:pStyle w:val="1"/>
         <w:ind w:firstLine="709"/>
       </w:pPr>
-      <w:bookmarkStart w:id="0" w:name="_Toc242378551"/>
+      <w:bookmarkStart w:id="0" w:name="_Toc242385935"/>
       <w:r>
         <w:rPr>
           <w:rFonts w:ascii="Times New Roman" w:hAnsi="Times New Roman"/>
@@ -1656,7 +1656,7 @@
         <w:pStyle w:val="1"/>
         <w:ind w:firstLine="709"/>
       </w:pPr>
-      <w:bookmarkStart w:id="1" w:name="_Toc242378552"/>
+      <w:bookmarkStart w:id="1" w:name="_Toc242385936"/>
       <w:r>
         <w:rPr>
           <w:rFonts w:ascii="Times New Roman" w:hAnsi="Times New Roman"/>
@@ -1826,7 +1826,7 @@
         <w:pStyle w:val="1"/>
         <w:ind w:firstLine="709"/>
       </w:pPr>
-      <w:bookmarkStart w:id="2" w:name="_Toc242378553"/>
+      <w:bookmarkStart w:id="2" w:name="_Toc242385937"/>
       <w:r>
         <w:rPr>
           <w:rFonts w:ascii="Times New Roman" w:hAnsi="Times New Roman"/>
@@ -1842,7 +1842,7 @@
         <w:spacing w:before="360"/>
         <w:ind w:firstLine="709"/>
       </w:pPr>
-      <w:bookmarkStart w:id="3" w:name="_Toc242378554"/>
+      <w:bookmarkStart w:id="3" w:name="_Toc242385938"/>
       <w:r>
         <w:rPr>
           <w:rFonts w:ascii="Times New Roman" w:hAnsi="Times New Roman"/>
@@ -1881,7 +1881,7 @@
         <w:rPr>
           <w:i/>
         </w:rPr>
-        <w:t>net8.0</w:t>
+        <w:t>net10.0</w:t>
       </w:r>
       <w:r>
         <w:t xml:space="preserve"> (</w:t>
@@ -1893,7 +1893,7 @@
         <w:t>SDK</w:t>
       </w:r>
       <w:r>
-        <w:t xml:space="preserve"> 9.0.318), замеры выполнены в режиме </w:t>
+        <w:t xml:space="preserve"> 10.0.401), замеры выполнены в режиме </w:t>
       </w:r>
       <w:r>
         <w:rPr>
@@ -1947,7 +1947,7 @@
         <w:spacing w:before="360"/>
         <w:ind w:firstLine="709"/>
       </w:pPr>
-      <w:bookmarkStart w:id="4" w:name="_Toc242378555"/>
+      <w:bookmarkStart w:id="4" w:name="_Toc242385939"/>
       <w:r>
         <w:rPr>
           <w:rFonts w:ascii="Times New Roman" w:hAnsi="Times New Roman"/>
@@ -2012,7 +2012,7 @@
           <w:noProof/>
         </w:rPr>
         <w:drawing>
-          <wp:inline distT="0" distB="0" distL="0" distR="0" wp14:anchorId="0C476C2E" wp14:editId="2B0DD862">
+          <wp:inline distT="0" distB="0" distL="0" distR="0" wp14:anchorId="1591204D" wp14:editId="7B90F0B4">
             <wp:extent cx="5580000" cy="2557049"/>
             <wp:effectExtent l="0" t="0" r="0" b="0"/>
             <wp:docPr id="1" name="Picture 1"/>
@@ -2073,7 +2073,7 @@
         <w:t>LOH</w:t>
       </w:r>
       <w:r>
-        <w:t xml:space="preserve"> занято 15 МБ, после создания утечек 24 МБ.</w:t>
+        <w:t xml:space="preserve"> занято 14 МБ, после создания утечек 24 МБ.</w:t>
       </w:r>
     </w:p>
     <w:p>
@@ -2097,7 +2097,7 @@
         </w:rPr>
         <w:lastRenderedPageBreak/>
         <w:drawing>
-          <wp:inline distT="0" distB="0" distL="0" distR="0" wp14:anchorId="4D32FFDE" wp14:editId="388EC070">
+          <wp:inline distT="0" distB="0" distL="0" distR="0" wp14:anchorId="026F1537" wp14:editId="7A8DA124">
             <wp:extent cx="5580000" cy="2557049"/>
             <wp:effectExtent l="0" t="0" r="0" b="0"/>
             <wp:docPr id="2" name="Picture 2"/>
@@ -2149,7 +2149,7 @@
         <w:jc w:val="both"/>
       </w:pPr>
       <w:r>
-        <w:t>Добавление миллиона чисел с упаковкой заняло 96 мс, без упаковки 7 мс. После очистки объем памяти уменьшился до 4 МБ, а новый объект после сборки перешел из поколения 0 в поколение 1.</w:t>
+        <w:t>Добавление миллиона чисел с упаковкой заняло 87 мс, без упаковки 6 мс. После очистки объем памяти уменьшился до 4 МБ, а новый объект после сборки перешел из поколения 0 в поколение 1.</w:t>
       </w:r>
     </w:p>
     <w:p>
@@ -2158,7 +2158,7 @@
         <w:spacing w:before="360"/>
         <w:ind w:firstLine="709"/>
       </w:pPr>
-      <w:bookmarkStart w:id="5" w:name="_Toc242378556"/>
+      <w:bookmarkStart w:id="5" w:name="_Toc242385940"/>
       <w:r>
         <w:rPr>
           <w:rFonts w:ascii="Times New Roman" w:hAnsi="Times New Roman"/>
@@ -2236,376 +2236,253 @@
     </w:p>
     <w:p>
       <w:pPr>
-        <w:spacing w:line="240" w:lineRule="auto"/>
-      </w:pPr>
-      <w:r>
-        <w:rPr>
-          <w:i/>
-          <w:sz w:val="24"/>
-        </w:rPr>
+        <w:pStyle w:val="Listing"/>
+      </w:pPr>
+      <w:r>
         <w:t>// Класс со статическим списком (1.1)</w:t>
       </w:r>
     </w:p>
     <w:p>
       <w:pPr>
-        <w:spacing w:line="240" w:lineRule="auto"/>
-      </w:pPr>
-      <w:r>
-        <w:rPr>
-          <w:i/>
-          <w:sz w:val="24"/>
-        </w:rPr>
+        <w:pStyle w:val="Listing"/>
+      </w:pPr>
+      <w:r>
         <w:t>public class StaticLeak</w:t>
       </w:r>
     </w:p>
     <w:p>
       <w:pPr>
-        <w:spacing w:line="240" w:lineRule="auto"/>
-      </w:pPr>
-      <w:r>
-        <w:rPr>
-          <w:i/>
-          <w:sz w:val="24"/>
-        </w:rPr>
+        <w:pStyle w:val="Listing"/>
+      </w:pPr>
+      <w:r>
         <w:t>{</w:t>
       </w:r>
     </w:p>
     <w:p>
       <w:pPr>
-        <w:spacing w:line="240" w:lineRule="auto"/>
-      </w:pPr>
-      <w:r>
-        <w:rPr>
-          <w:i/>
-          <w:sz w:val="24"/>
-        </w:rPr>
+        <w:pStyle w:val="Listing"/>
+      </w:pPr>
+      <w:r>
         <w:t xml:space="preserve">    private static List&lt;byte[]&gt; _list = new List&lt;byte[]&gt;();</w:t>
       </w:r>
     </w:p>
     <w:p>
       <w:pPr>
-        <w:spacing w:line="240" w:lineRule="auto"/>
-      </w:pPr>
-    </w:p>
-    <w:p>
-      <w:pPr>
-        <w:spacing w:line="240" w:lineRule="auto"/>
-      </w:pPr>
-      <w:r>
-        <w:rPr>
-          <w:i/>
-          <w:sz w:val="24"/>
-        </w:rPr>
+        <w:pStyle w:val="Listing"/>
+      </w:pPr>
+    </w:p>
+    <w:p>
+      <w:pPr>
+        <w:pStyle w:val="Listing"/>
+      </w:pPr>
+      <w:r>
         <w:t xml:space="preserve">    public static void AddData()</w:t>
       </w:r>
     </w:p>
     <w:p>
       <w:pPr>
-        <w:spacing w:line="240" w:lineRule="auto"/>
-      </w:pPr>
-      <w:r>
-        <w:rPr>
-          <w:i/>
-          <w:sz w:val="24"/>
-        </w:rPr>
+        <w:pStyle w:val="Listing"/>
+      </w:pPr>
+      <w:r>
         <w:t xml:space="preserve">    {</w:t>
       </w:r>
     </w:p>
     <w:p>
       <w:pPr>
-        <w:spacing w:line="240" w:lineRule="auto"/>
-      </w:pPr>
-      <w:r>
-        <w:rPr>
-          <w:i/>
-          <w:sz w:val="24"/>
-        </w:rPr>
+        <w:pStyle w:val="Listing"/>
+      </w:pPr>
+      <w:r>
         <w:t xml:space="preserve">        for (int i = 0; i &lt; 1000; i++)</w:t>
       </w:r>
     </w:p>
     <w:p>
       <w:pPr>
-        <w:spacing w:line="240" w:lineRule="auto"/>
-      </w:pPr>
-      <w:r>
-        <w:rPr>
-          <w:i/>
-          <w:sz w:val="24"/>
-        </w:rPr>
+        <w:pStyle w:val="Listing"/>
+      </w:pPr>
+      <w:r>
         <w:t xml:space="preserve">            _list.Add(new byte[1024 * 10]);</w:t>
       </w:r>
     </w:p>
     <w:p>
       <w:pPr>
-        <w:spacing w:line="240" w:lineRule="auto"/>
-      </w:pPr>
-      <w:r>
-        <w:rPr>
-          <w:i/>
-          <w:sz w:val="24"/>
-        </w:rPr>
+        <w:pStyle w:val="Listing"/>
+      </w:pPr>
+      <w:r>
         <w:t xml:space="preserve">    }</w:t>
       </w:r>
     </w:p>
     <w:p>
       <w:pPr>
-        <w:spacing w:line="240" w:lineRule="auto"/>
-      </w:pPr>
-      <w:r>
-        <w:rPr>
-          <w:i/>
-          <w:sz w:val="24"/>
-        </w:rPr>
+        <w:pStyle w:val="Listing"/>
+      </w:pPr>
+      <w:r>
         <w:t>}</w:t>
       </w:r>
     </w:p>
     <w:p>
       <w:pPr>
-        <w:spacing w:line="240" w:lineRule="auto"/>
-      </w:pPr>
-    </w:p>
-    <w:p>
-      <w:pPr>
-        <w:spacing w:line="240" w:lineRule="auto"/>
-      </w:pPr>
-      <w:r>
-        <w:rPr>
-          <w:i/>
-          <w:sz w:val="24"/>
-        </w:rPr>
+        <w:pStyle w:val="Listing"/>
+      </w:pPr>
+    </w:p>
+    <w:p>
+      <w:pPr>
+        <w:pStyle w:val="Listing"/>
+      </w:pPr>
+      <w:r>
         <w:t>// Класс с событием (1.2): большой объект создаётся при подписке и удерживается обработчиком</w:t>
       </w:r>
     </w:p>
     <w:p>
       <w:pPr>
-        <w:spacing w:line="240" w:lineRule="auto"/>
-      </w:pPr>
-      <w:r>
-        <w:rPr>
-          <w:i/>
-          <w:sz w:val="24"/>
-        </w:rPr>
+        <w:pStyle w:val="Listing"/>
+      </w:pPr>
+      <w:r>
         <w:t>public class EventLeak</w:t>
       </w:r>
     </w:p>
     <w:p>
       <w:pPr>
-        <w:spacing w:line="240" w:lineRule="auto"/>
-      </w:pPr>
-      <w:r>
-        <w:rPr>
-          <w:i/>
-          <w:sz w:val="24"/>
-        </w:rPr>
+        <w:pStyle w:val="Listing"/>
+      </w:pPr>
+      <w:r>
         <w:t>{</w:t>
       </w:r>
     </w:p>
     <w:p>
       <w:pPr>
-        <w:spacing w:line="240" w:lineRule="auto"/>
-      </w:pPr>
-      <w:r>
-        <w:rPr>
-          <w:i/>
-          <w:sz w:val="24"/>
-        </w:rPr>
+        <w:pStyle w:val="Listing"/>
+      </w:pPr>
+      <w:r>
         <w:t xml:space="preserve">    public event EventHandler? BigEvent;</w:t>
       </w:r>
     </w:p>
     <w:p>
       <w:pPr>
-        <w:spacing w:line="240" w:lineRule="auto"/>
-      </w:pPr>
-      <w:r>
-        <w:rPr>
-          <w:i/>
-          <w:sz w:val="24"/>
-        </w:rPr>
+        <w:pStyle w:val="Listing"/>
+      </w:pPr>
+      <w:r>
         <w:t xml:space="preserve">    private List&lt;EventHandler&gt; _handlers = new List&lt;EventHandler&gt;();</w:t>
       </w:r>
     </w:p>
     <w:p>
       <w:pPr>
-        <w:spacing w:line="240" w:lineRule="auto"/>
-      </w:pPr>
-    </w:p>
-    <w:p>
-      <w:pPr>
-        <w:spacing w:line="240" w:lineRule="auto"/>
-      </w:pPr>
-      <w:r>
-        <w:rPr>
-          <w:i/>
-          <w:sz w:val="24"/>
-        </w:rPr>
+        <w:pStyle w:val="Listing"/>
+      </w:pPr>
+    </w:p>
+    <w:p>
+      <w:pPr>
+        <w:pStyle w:val="Listing"/>
+      </w:pPr>
+      <w:r>
         <w:t xml:space="preserve">    public void Subscribe()</w:t>
       </w:r>
     </w:p>
     <w:p>
       <w:pPr>
-        <w:spacing w:line="240" w:lineRule="auto"/>
-      </w:pPr>
-      <w:r>
-        <w:rPr>
-          <w:i/>
-          <w:sz w:val="24"/>
-        </w:rPr>
+        <w:pStyle w:val="Listing"/>
+      </w:pPr>
+      <w:r>
         <w:t xml:space="preserve">    {</w:t>
       </w:r>
     </w:p>
     <w:p>
       <w:pPr>
-        <w:spacing w:line="240" w:lineRule="auto"/>
-      </w:pPr>
-      <w:r>
-        <w:rPr>
-          <w:i/>
-          <w:sz w:val="24"/>
-        </w:rPr>
+        <w:pStyle w:val="Listing"/>
+      </w:pPr>
+      <w:r>
         <w:t xml:space="preserve">        var data = new byte[1024 * 100];</w:t>
       </w:r>
     </w:p>
     <w:p>
       <w:pPr>
-        <w:spacing w:line="240" w:lineRule="auto"/>
-      </w:pPr>
-      <w:r>
-        <w:rPr>
-          <w:i/>
-          <w:sz w:val="24"/>
-        </w:rPr>
+        <w:pStyle w:val="Listing"/>
+      </w:pPr>
+      <w:r>
         <w:t xml:space="preserve">        EventHandler handler = (sender, e) =&gt; { data[0]++; };</w:t>
       </w:r>
     </w:p>
     <w:p>
       <w:pPr>
-        <w:spacing w:line="240" w:lineRule="auto"/>
-      </w:pPr>
-      <w:r>
-        <w:rPr>
-          <w:i/>
-          <w:sz w:val="24"/>
-        </w:rPr>
+        <w:pStyle w:val="Listing"/>
+      </w:pPr>
+      <w:r>
         <w:t xml:space="preserve">        BigEvent += handler;</w:t>
       </w:r>
     </w:p>
     <w:p>
       <w:pPr>
-        <w:spacing w:line="240" w:lineRule="auto"/>
-      </w:pPr>
-      <w:r>
-        <w:rPr>
-          <w:i/>
-          <w:sz w:val="24"/>
-        </w:rPr>
-        <w:t xml:space="preserve">        _handlers.Add(</w:t>
-      </w:r>
-      <w:r>
-        <w:rPr>
-          <w:i/>
-          <w:sz w:val="24"/>
-        </w:rPr>
-        <w:t>handler);</w:t>
-      </w:r>
-    </w:p>
-    <w:p>
-      <w:pPr>
-        <w:spacing w:line="240" w:lineRule="auto"/>
-      </w:pPr>
-      <w:r>
-        <w:rPr>
-          <w:i/>
-          <w:sz w:val="24"/>
-        </w:rPr>
+        <w:pStyle w:val="Listing"/>
+      </w:pPr>
+      <w:r>
+        <w:t xml:space="preserve">        _handlers.Add(handler);</w:t>
+      </w:r>
+    </w:p>
+    <w:p>
+      <w:pPr>
+        <w:pStyle w:val="Listing"/>
+      </w:pPr>
+      <w:r>
         <w:t xml:space="preserve">    }</w:t>
       </w:r>
     </w:p>
     <w:p>
       <w:pPr>
-        <w:spacing w:line="240" w:lineRule="auto"/>
-      </w:pPr>
-    </w:p>
-    <w:p>
-      <w:pPr>
-        <w:spacing w:line="240" w:lineRule="auto"/>
-      </w:pPr>
-      <w:r>
-        <w:rPr>
-          <w:i/>
-          <w:sz w:val="24"/>
-        </w:rPr>
+        <w:pStyle w:val="Listing"/>
+      </w:pPr>
+    </w:p>
+    <w:p>
+      <w:pPr>
+        <w:pStyle w:val="Listing"/>
+      </w:pPr>
+      <w:r>
         <w:t xml:space="preserve">    public void UnsubscribeAll()</w:t>
       </w:r>
     </w:p>
     <w:p>
       <w:pPr>
-        <w:spacing w:line="240" w:lineRule="auto"/>
-      </w:pPr>
-      <w:r>
-        <w:rPr>
-          <w:i/>
-          <w:sz w:val="24"/>
-        </w:rPr>
+        <w:pStyle w:val="Listing"/>
+      </w:pPr>
+      <w:r>
         <w:t xml:space="preserve">    {</w:t>
       </w:r>
     </w:p>
     <w:p>
       <w:pPr>
-        <w:spacing w:line="240" w:lineRule="auto"/>
-      </w:pPr>
-      <w:r>
-        <w:rPr>
-          <w:i/>
-          <w:sz w:val="24"/>
-        </w:rPr>
+        <w:pStyle w:val="Listing"/>
+      </w:pPr>
+      <w:r>
         <w:t xml:space="preserve">        foreach (var handler in _handlers)</w:t>
       </w:r>
     </w:p>
     <w:p>
       <w:pPr>
-        <w:spacing w:line="240" w:lineRule="auto"/>
-      </w:pPr>
-      <w:r>
-        <w:rPr>
-          <w:i/>
-          <w:sz w:val="24"/>
-        </w:rPr>
+        <w:pStyle w:val="Listing"/>
+      </w:pPr>
+      <w:r>
         <w:t xml:space="preserve">            BigEvent -= handler;</w:t>
       </w:r>
     </w:p>
     <w:p>
       <w:pPr>
-        <w:spacing w:line="240" w:lineRule="auto"/>
-      </w:pPr>
-      <w:r>
-        <w:rPr>
-          <w:i/>
-          <w:sz w:val="24"/>
-        </w:rPr>
+        <w:pStyle w:val="Listing"/>
+      </w:pPr>
+      <w:r>
         <w:t xml:space="preserve">        _handlers.Clear();</w:t>
       </w:r>
     </w:p>
     <w:p>
       <w:pPr>
-        <w:spacing w:line="240" w:lineRule="auto"/>
-      </w:pPr>
-      <w:r>
-        <w:rPr>
-          <w:i/>
-          <w:sz w:val="24"/>
-        </w:rPr>
+        <w:pStyle w:val="Listing"/>
+      </w:pPr>
+      <w:r>
         <w:t xml:space="preserve">    }</w:t>
       </w:r>
     </w:p>
     <w:p>
       <w:pPr>
-        <w:spacing w:line="240" w:lineRule="auto"/>
-      </w:pPr>
-      <w:r>
-        <w:rPr>
-          <w:i/>
-          <w:sz w:val="24"/>
-        </w:rPr>
+        <w:pStyle w:val="Listing"/>
+      </w:pPr>
+      <w:r>
         <w:t>}</w:t>
       </w:r>
     </w:p>
@@ -2630,7 +2507,7 @@
           <w:noProof/>
         </w:rPr>
         <w:drawing>
-          <wp:inline distT="0" distB="0" distL="0" distR="0" wp14:anchorId="57796BE4" wp14:editId="682CF68C">
+          <wp:inline distT="0" distB="0" distL="0" distR="0" wp14:anchorId="266BCAD5" wp14:editId="10511563">
             <wp:extent cx="5580000" cy="1646913"/>
             <wp:effectExtent l="0" t="0" r="0" b="0"/>
             <wp:docPr id="3" name="Picture 3"/>
@@ -2694,7 +2571,7 @@
         <w:t>()</w:t>
       </w:r>
       <w:r>
-        <w:t xml:space="preserve"> осталась 10 324 КБ. После 100 подписок память выросла с 10 332 КБ до 20 357 КБ, сборка ее не освободила, а после отписки память вернулась к 10 339 КБ.</w:t>
+        <w:t xml:space="preserve"> осталась 10 328 КБ. После 100 подписок память выросла с 10 336 КБ до 20 358 КБ, сборка ее не освободила, а после отписки память вернулась к 10 339 КБ.</w:t>
       </w:r>
     </w:p>
     <w:p>
@@ -2703,7 +2580,7 @@
         <w:spacing w:before="360"/>
         <w:ind w:firstLine="709"/>
       </w:pPr>
-      <w:bookmarkStart w:id="6" w:name="_Toc242378557"/>
+      <w:bookmarkStart w:id="6" w:name="_Toc242385941"/>
       <w:r>
         <w:rPr>
           <w:rFonts w:ascii="Times New Roman" w:hAnsi="Times New Roman"/>
@@ -2752,7 +2629,7 @@
         </w:rPr>
         <w:lastRenderedPageBreak/>
         <w:drawing>
-          <wp:inline distT="0" distB="0" distL="0" distR="0" wp14:anchorId="1FFB4835" wp14:editId="060DC996">
+          <wp:inline distT="0" distB="0" distL="0" distR="0" wp14:anchorId="11AE3FCC" wp14:editId="64D23DDD">
             <wp:extent cx="5580000" cy="1386874"/>
             <wp:effectExtent l="0" t="0" r="0" b="0"/>
             <wp:docPr id="4" name="Picture 4"/>
@@ -2831,7 +2708,7 @@
         <w:t>LOH</w:t>
       </w:r>
       <w:r>
-        <w:t xml:space="preserve">. Память выросла с 10 513 КБ до 20 502 КБ и после очистки списка и </w:t>
+        <w:t xml:space="preserve">. Память выросла с 10 513 КБ до 20 510 КБ и после очистки списка и </w:t>
       </w:r>
       <w:r>
         <w:rPr>
@@ -2852,7 +2729,7 @@
         <w:spacing w:before="360"/>
         <w:ind w:firstLine="709"/>
       </w:pPr>
-      <w:bookmarkStart w:id="7" w:name="_Toc242378558"/>
+      <w:bookmarkStart w:id="7" w:name="_Toc242385942"/>
       <w:r>
         <w:rPr>
           <w:rFonts w:ascii="Times New Roman" w:hAnsi="Times New Roman"/>
@@ -2990,150 +2867,102 @@
     </w:p>
     <w:p>
       <w:pPr>
-        <w:spacing w:line="240" w:lineRule="auto"/>
-      </w:pPr>
-      <w:r>
-        <w:rPr>
-          <w:i/>
-          <w:sz w:val="24"/>
-        </w:rPr>
+        <w:pStyle w:val="Listing"/>
+      </w:pPr>
+      <w:r>
         <w:t>// НЕОПТИМИЗИРОВАННО</w:t>
       </w:r>
     </w:p>
     <w:p>
       <w:pPr>
-        <w:spacing w:line="240" w:lineRule="auto"/>
-      </w:pPr>
-      <w:r>
-        <w:rPr>
-          <w:i/>
-          <w:sz w:val="24"/>
-        </w:rPr>
+        <w:pStyle w:val="Listing"/>
+      </w:pPr>
+      <w:r>
         <w:t>public class UnoptimizedCode</w:t>
       </w:r>
     </w:p>
     <w:p>
       <w:pPr>
-        <w:spacing w:line="240" w:lineRule="auto"/>
-      </w:pPr>
-      <w:r>
-        <w:rPr>
-          <w:i/>
-          <w:sz w:val="24"/>
-        </w:rPr>
+        <w:pStyle w:val="Listing"/>
+      </w:pPr>
+      <w:r>
         <w:t>{</w:t>
       </w:r>
     </w:p>
     <w:p>
       <w:pPr>
-        <w:spacing w:line="240" w:lineRule="auto"/>
-      </w:pPr>
-      <w:r>
-        <w:rPr>
-          <w:i/>
-          <w:sz w:val="24"/>
-        </w:rPr>
+        <w:pStyle w:val="Listing"/>
+      </w:pPr>
+      <w:r>
         <w:t xml:space="preserve">    private ArrayList _data = new ArrayList();</w:t>
       </w:r>
     </w:p>
     <w:p>
       <w:pPr>
-        <w:spacing w:line="240" w:lineRule="auto"/>
-      </w:pPr>
-      <w:r>
-        <w:rPr>
-          <w:i/>
-          <w:sz w:val="24"/>
-        </w:rPr>
+        <w:pStyle w:val="Listing"/>
+      </w:pPr>
+      <w:r>
         <w:t xml:space="preserve">    public void Add(int value) =&gt; _data.Add(value); // Boxing!</w:t>
       </w:r>
     </w:p>
     <w:p>
       <w:pPr>
-        <w:spacing w:line="240" w:lineRule="auto"/>
-      </w:pPr>
-      <w:r>
-        <w:rPr>
-          <w:i/>
-          <w:sz w:val="24"/>
-        </w:rPr>
+        <w:pStyle w:val="Listing"/>
+      </w:pPr>
+      <w:r>
         <w:t>}</w:t>
       </w:r>
     </w:p>
     <w:p>
       <w:pPr>
-        <w:spacing w:line="240" w:lineRule="auto"/>
-      </w:pPr>
-    </w:p>
-    <w:p>
-      <w:pPr>
-        <w:spacing w:line="240" w:lineRule="auto"/>
-      </w:pPr>
-      <w:r>
-        <w:rPr>
-          <w:i/>
-          <w:sz w:val="24"/>
-        </w:rPr>
+        <w:pStyle w:val="Listing"/>
+      </w:pPr>
+    </w:p>
+    <w:p>
+      <w:pPr>
+        <w:pStyle w:val="Listing"/>
+      </w:pPr>
+      <w:r>
         <w:t>// ОПТИМИЗИРОВАННО</w:t>
       </w:r>
     </w:p>
     <w:p>
       <w:pPr>
-        <w:spacing w:line="240" w:lineRule="auto"/>
-      </w:pPr>
-      <w:r>
-        <w:rPr>
-          <w:i/>
-          <w:sz w:val="24"/>
-        </w:rPr>
+        <w:pStyle w:val="Listing"/>
+      </w:pPr>
+      <w:r>
         <w:t>public class OptimizedCode</w:t>
       </w:r>
     </w:p>
     <w:p>
       <w:pPr>
-        <w:spacing w:line="240" w:lineRule="auto"/>
-      </w:pPr>
-      <w:r>
-        <w:rPr>
-          <w:i/>
-          <w:sz w:val="24"/>
-        </w:rPr>
+        <w:pStyle w:val="Listing"/>
+      </w:pPr>
+      <w:r>
         <w:t>{</w:t>
       </w:r>
     </w:p>
     <w:p>
       <w:pPr>
-        <w:spacing w:line="240" w:lineRule="auto"/>
-      </w:pPr>
-      <w:r>
-        <w:rPr>
-          <w:i/>
-          <w:sz w:val="24"/>
-        </w:rPr>
+        <w:pStyle w:val="Listing"/>
+      </w:pPr>
+      <w:r>
         <w:t xml:space="preserve">    private List&lt;int&gt; _data = new List&lt;int&gt;();</w:t>
       </w:r>
     </w:p>
     <w:p>
       <w:pPr>
-        <w:spacing w:line="240" w:lineRule="auto"/>
-      </w:pPr>
-      <w:r>
-        <w:rPr>
-          <w:i/>
-          <w:sz w:val="24"/>
-        </w:rPr>
+        <w:pStyle w:val="Listing"/>
+      </w:pPr>
+      <w:r>
         <w:t xml:space="preserve">    public void Add(int value) =&gt; _data.Add(value); // Без boxing</w:t>
       </w:r>
     </w:p>
     <w:p>
       <w:pPr>
-        <w:spacing w:line="240" w:lineRule="auto"/>
-      </w:pPr>
-      <w:r>
-        <w:rPr>
-          <w:i/>
-          <w:sz w:val="24"/>
-        </w:rPr>
+        <w:pStyle w:val="Listing"/>
+      </w:pPr>
+      <w:r>
         <w:t>}</w:t>
       </w:r>
     </w:p>
@@ -3158,7 +2987,7 @@
           <w:noProof/>
         </w:rPr>
         <w:drawing>
-          <wp:inline distT="0" distB="0" distL="0" distR="0" wp14:anchorId="59FB3909" wp14:editId="15C7FB4B">
+          <wp:inline distT="0" distB="0" distL="0" distR="0" wp14:anchorId="709C2F6F" wp14:editId="32D4A199">
             <wp:extent cx="5580000" cy="1256854"/>
             <wp:effectExtent l="0" t="0" r="0" b="0"/>
             <wp:docPr id="5" name="Picture 5"/>
@@ -3231,7 +3060,7 @@
         <w:t>&gt;</w:t>
       </w:r>
       <w:r>
-        <w:t xml:space="preserve"> выполнился за 71 мс и занял 31 652 КБ, </w:t>
+        <w:t xml:space="preserve"> выполнился за 105 мс и занял 31 650 КБ, </w:t>
       </w:r>
       <w:r>
         <w:rPr>
@@ -3261,7 +3090,7 @@
         <w:t>ArrayList</w:t>
       </w:r>
       <w:r>
-        <w:t xml:space="preserve"> получено 77 мс и 37 774 КБ, для </w:t>
+        <w:t xml:space="preserve"> получено 95 мс и 37 774 КБ, для </w:t>
       </w:r>
       <w:r>
         <w:rPr>
@@ -3282,7 +3111,7 @@
         <w:t>&gt;</w:t>
       </w:r>
       <w:r>
-        <w:t xml:space="preserve"> – 4 мс и 8 204 КБ. Причина разницы в том, что при упаковке каждое число становится отдельным объектом в куче.</w:t>
+        <w:t xml:space="preserve"> – 4 мс и 8 202 КБ. Причина разницы в том, что при упаковке каждое число становится отдельным объектом в куче.</w:t>
       </w:r>
     </w:p>
     <w:p>
@@ -3291,7 +3120,7 @@
         <w:spacing w:before="360"/>
         <w:ind w:firstLine="709"/>
       </w:pPr>
-      <w:bookmarkStart w:id="8" w:name="_Toc242378559"/>
+      <w:bookmarkStart w:id="8" w:name="_Toc242385943"/>
       <w:r>
         <w:rPr>
           <w:rFonts w:ascii="Times New Roman" w:hAnsi="Times New Roman"/>
@@ -3715,543 +3544,362 @@
     </w:p>
     <w:p>
       <w:pPr>
-        <w:spacing w:line="240" w:lineRule="auto"/>
-      </w:pPr>
-      <w:r>
-        <w:rPr>
-          <w:i/>
-          <w:sz w:val="24"/>
-        </w:rPr>
+        <w:pStyle w:val="Listing"/>
+      </w:pPr>
+      <w:r>
         <w:t>public class BuggyCode</w:t>
       </w:r>
     </w:p>
     <w:p>
       <w:pPr>
-        <w:spacing w:line="240" w:lineRule="auto"/>
-      </w:pPr>
-      <w:r>
-        <w:rPr>
-          <w:i/>
-          <w:sz w:val="24"/>
-        </w:rPr>
+        <w:pStyle w:val="Listing"/>
+      </w:pPr>
+      <w:r>
         <w:t>{</w:t>
       </w:r>
     </w:p>
     <w:p>
       <w:pPr>
-        <w:spacing w:line="240" w:lineRule="auto"/>
-      </w:pPr>
-      <w:r>
-        <w:rPr>
-          <w:i/>
-          <w:sz w:val="24"/>
-        </w:rPr>
+        <w:pStyle w:val="Listing"/>
+      </w:pPr>
+      <w:r>
         <w:t xml:space="preserve">    private static List&lt;IDisposable&gt; _cache = new List&lt;IDisposable&gt;();</w:t>
       </w:r>
     </w:p>
     <w:p>
       <w:pPr>
-        <w:spacing w:line="240" w:lineRule="auto"/>
-      </w:pPr>
-      <w:r>
-        <w:rPr>
-          <w:i/>
-          <w:sz w:val="24"/>
-        </w:rPr>
+        <w:pStyle w:val="Listing"/>
+      </w:pPr>
+      <w:r>
         <w:t xml:space="preserve">    private static event EventHandler? _globalEvent;</w:t>
       </w:r>
     </w:p>
     <w:p>
       <w:pPr>
-        <w:spacing w:line="240" w:lineRule="auto"/>
-      </w:pPr>
-      <w:r>
-        <w:rPr>
-          <w:i/>
-          <w:sz w:val="24"/>
-        </w:rPr>
+        <w:pStyle w:val="Listing"/>
+      </w:pPr>
+      <w:r>
         <w:t xml:space="preserve">    private byte[] _data = new byte[1024 * 1024];</w:t>
       </w:r>
     </w:p>
     <w:p>
       <w:pPr>
-        <w:spacing w:line="240" w:lineRule="auto"/>
-      </w:pPr>
-    </w:p>
-    <w:p>
-      <w:pPr>
-        <w:spacing w:line="240" w:lineRule="auto"/>
-      </w:pPr>
-      <w:r>
-        <w:rPr>
-          <w:i/>
-          <w:sz w:val="24"/>
-        </w:rPr>
+        <w:pStyle w:val="Listing"/>
+      </w:pPr>
+    </w:p>
+    <w:p>
+      <w:pPr>
+        <w:pStyle w:val="Listing"/>
+      </w:pPr>
+      <w:r>
         <w:t xml:space="preserve">    public BuggyCode()</w:t>
       </w:r>
     </w:p>
     <w:p>
       <w:pPr>
-        <w:spacing w:line="240" w:lineRule="auto"/>
-      </w:pPr>
-      <w:r>
-        <w:rPr>
-          <w:i/>
-          <w:sz w:val="24"/>
-        </w:rPr>
+        <w:pStyle w:val="Listing"/>
+      </w:pPr>
+      <w:r>
         <w:t xml:space="preserve">    {</w:t>
       </w:r>
     </w:p>
     <w:p>
       <w:pPr>
-        <w:spacing w:line="240" w:lineRule="auto"/>
-      </w:pPr>
-      <w:r>
-        <w:rPr>
-          <w:i/>
-          <w:sz w:val="24"/>
-        </w:rPr>
-        <w:t xml:space="preserve">        _globalEvent += OnEvent</w:t>
-      </w:r>
-      <w:r>
-        <w:rPr>
-          <w:i/>
-          <w:sz w:val="24"/>
-        </w:rPr>
-        <w:t>;              // Утечка 1: подписка на статическое событие без отписки</w:t>
-      </w:r>
-    </w:p>
-    <w:p>
-      <w:pPr>
-        <w:spacing w:line="240" w:lineRule="auto"/>
-      </w:pPr>
-      <w:r>
-        <w:rPr>
-          <w:i/>
-          <w:sz w:val="24"/>
-        </w:rPr>
+        <w:pStyle w:val="Listing"/>
+      </w:pPr>
+      <w:r>
+        <w:t xml:space="preserve">        _globalEvent += OnEvent;              // Утечка 1: подписка на статическое событие без отписки</w:t>
+      </w:r>
+    </w:p>
+    <w:p>
+      <w:pPr>
+        <w:pStyle w:val="Listing"/>
+      </w:pPr>
+      <w:r>
         <w:t xml:space="preserve">        _cache.Add(new MemoryStream(1024));   // Утечка 2: статический кэш хранит MemoryStream и не освобождает его</w:t>
       </w:r>
     </w:p>
     <w:p>
       <w:pPr>
-        <w:spacing w:line="240" w:lineRule="auto"/>
-      </w:pPr>
-      <w:r>
-        <w:rPr>
-          <w:i/>
-          <w:sz w:val="24"/>
-        </w:rPr>
+        <w:pStyle w:val="Listing"/>
+      </w:pPr>
+      <w:r>
         <w:t xml:space="preserve">    }</w:t>
       </w:r>
     </w:p>
     <w:p>
       <w:pPr>
-        <w:spacing w:line="240" w:lineRule="auto"/>
-      </w:pPr>
-    </w:p>
-    <w:p>
-      <w:pPr>
-        <w:spacing w:line="240" w:lineRule="auto"/>
-      </w:pPr>
-      <w:r>
-        <w:rPr>
-          <w:i/>
-          <w:sz w:val="24"/>
-        </w:rPr>
+        <w:pStyle w:val="Listing"/>
+      </w:pPr>
+    </w:p>
+    <w:p>
+      <w:pPr>
+        <w:pStyle w:val="Listing"/>
+      </w:pPr>
+      <w:r>
         <w:t xml:space="preserve">    private void OnEvent(object? sender, EventArgs e)</w:t>
       </w:r>
     </w:p>
     <w:p>
       <w:pPr>
-        <w:spacing w:line="240" w:lineRule="auto"/>
-      </w:pPr>
-      <w:r>
-        <w:rPr>
-          <w:i/>
-          <w:sz w:val="24"/>
-        </w:rPr>
+        <w:pStyle w:val="Listing"/>
+      </w:pPr>
+      <w:r>
         <w:t xml:space="preserve">    {</w:t>
       </w:r>
     </w:p>
     <w:p>
       <w:pPr>
-        <w:spacing w:line="240" w:lineRule="auto"/>
-      </w:pPr>
-      <w:r>
-        <w:rPr>
-          <w:i/>
-          <w:sz w:val="24"/>
-        </w:rPr>
+        <w:pStyle w:val="Listing"/>
+      </w:pPr>
+      <w:r>
         <w:t xml:space="preserve">        var temp = new byte[1024 * 100];</w:t>
       </w:r>
     </w:p>
     <w:p>
       <w:pPr>
-        <w:spacing w:line="240" w:lineRule="auto"/>
-      </w:pPr>
-      <w:r>
-        <w:rPr>
-          <w:i/>
-          <w:sz w:val="24"/>
-        </w:rPr>
+        <w:pStyle w:val="Listing"/>
+      </w:pPr>
+      <w:r>
         <w:t xml:space="preserve">    }</w:t>
       </w:r>
     </w:p>
     <w:p>
       <w:pPr>
-        <w:spacing w:line="240" w:lineRule="auto"/>
-      </w:pPr>
-    </w:p>
-    <w:p>
-      <w:pPr>
-        <w:spacing w:line="240" w:lineRule="auto"/>
-      </w:pPr>
-      <w:r>
-        <w:rPr>
-          <w:i/>
-          <w:sz w:val="24"/>
-        </w:rPr>
+        <w:pStyle w:val="Listing"/>
+      </w:pPr>
+    </w:p>
+    <w:p>
+      <w:pPr>
+        <w:pStyle w:val="Listing"/>
+      </w:pPr>
+      <w:r>
         <w:t xml:space="preserve">    public static int CacheCount =&gt; _cache.Count;</w:t>
       </w:r>
     </w:p>
     <w:p>
       <w:pPr>
-        <w:spacing w:line="240" w:lineRule="auto"/>
-      </w:pPr>
-      <w:r>
-        <w:rPr>
-          <w:i/>
-          <w:sz w:val="24"/>
-        </w:rPr>
+        <w:pStyle w:val="Listing"/>
+      </w:pPr>
+      <w:r>
         <w:t>}</w:t>
       </w:r>
     </w:p>
     <w:p>
       <w:pPr>
-        <w:spacing w:line="240" w:lineRule="auto"/>
-      </w:pPr>
-    </w:p>
-    <w:p>
-      <w:pPr>
-        <w:spacing w:line="240" w:lineRule="auto"/>
-      </w:pPr>
-      <w:r>
-        <w:rPr>
-          <w:i/>
-          <w:sz w:val="24"/>
-        </w:rPr>
+        <w:pStyle w:val="Listing"/>
+      </w:pPr>
+    </w:p>
+    <w:p>
+      <w:pPr>
+        <w:pStyle w:val="Listing"/>
+      </w:pPr>
+      <w:r>
         <w:t>public class FixedCode : IDisposable</w:t>
       </w:r>
     </w:p>
     <w:p>
       <w:pPr>
-        <w:spacing w:line="240" w:lineRule="auto"/>
-      </w:pPr>
-      <w:r>
-        <w:rPr>
-          <w:i/>
-          <w:sz w:val="24"/>
-        </w:rPr>
+        <w:pStyle w:val="Listing"/>
+      </w:pPr>
+      <w:r>
         <w:t>{</w:t>
       </w:r>
     </w:p>
     <w:p>
       <w:pPr>
-        <w:spacing w:line="240" w:lineRule="auto"/>
-      </w:pPr>
-      <w:r>
-        <w:rPr>
-          <w:i/>
-          <w:sz w:val="24"/>
-        </w:rPr>
+        <w:pStyle w:val="Listing"/>
+      </w:pPr>
+      <w:r>
+        <w:t xml:space="preserve">    private static List&lt;IDisposable&gt; _cache = new List&lt;IDisposable&gt;();</w:t>
+      </w:r>
+    </w:p>
+    <w:p>
+      <w:pPr>
+        <w:pStyle w:val="Listing"/>
+      </w:pPr>
+      <w:r>
         <w:lastRenderedPageBreak/>
-        <w:t xml:space="preserve">    private static List&lt;IDisposable&gt; _cache = new List&lt;IDisposable&gt;();</w:t>
-      </w:r>
-    </w:p>
-    <w:p>
-      <w:pPr>
-        <w:spacing w:line="240" w:lineRule="auto"/>
-      </w:pPr>
-      <w:r>
-        <w:rPr>
-          <w:i/>
-          <w:sz w:val="24"/>
-        </w:rPr>
-        <w:t xml:space="preserve">    private static event EventHandler? _</w:t>
-      </w:r>
-      <w:r>
-        <w:rPr>
-          <w:i/>
-          <w:sz w:val="24"/>
-        </w:rPr>
-        <w:t>globalEvent;</w:t>
-      </w:r>
-    </w:p>
-    <w:p>
-      <w:pPr>
-        <w:spacing w:line="240" w:lineRule="auto"/>
-      </w:pPr>
-      <w:r>
-        <w:rPr>
-          <w:i/>
-          <w:sz w:val="24"/>
-        </w:rPr>
+        <w:t xml:space="preserve">    private static event EventHandler? _globalEvent;</w:t>
+      </w:r>
+    </w:p>
+    <w:p>
+      <w:pPr>
+        <w:pStyle w:val="Listing"/>
+      </w:pPr>
+      <w:r>
         <w:t xml:space="preserve">    private byte[]? _data = new byte[1024 * 1024];</w:t>
       </w:r>
     </w:p>
     <w:p>
       <w:pPr>
-        <w:spacing w:line="240" w:lineRule="auto"/>
-      </w:pPr>
-      <w:r>
-        <w:rPr>
-          <w:i/>
-          <w:sz w:val="24"/>
-        </w:rPr>
+        <w:pStyle w:val="Listing"/>
+      </w:pPr>
+      <w:r>
         <w:t xml:space="preserve">    private MemoryStream _stream = new MemoryStream(1024);</w:t>
       </w:r>
     </w:p>
     <w:p>
       <w:pPr>
-        <w:spacing w:line="240" w:lineRule="auto"/>
-      </w:pPr>
-    </w:p>
-    <w:p>
-      <w:pPr>
-        <w:spacing w:line="240" w:lineRule="auto"/>
-      </w:pPr>
-      <w:r>
-        <w:rPr>
-          <w:i/>
-          <w:sz w:val="24"/>
-        </w:rPr>
+        <w:pStyle w:val="Listing"/>
+      </w:pPr>
+    </w:p>
+    <w:p>
+      <w:pPr>
+        <w:pStyle w:val="Listing"/>
+      </w:pPr>
+      <w:r>
         <w:t xml:space="preserve">    public FixedCode()</w:t>
       </w:r>
     </w:p>
     <w:p>
       <w:pPr>
-        <w:spacing w:line="240" w:lineRule="auto"/>
-      </w:pPr>
-      <w:r>
-        <w:rPr>
-          <w:i/>
-          <w:sz w:val="24"/>
-        </w:rPr>
+        <w:pStyle w:val="Listing"/>
+      </w:pPr>
+      <w:r>
         <w:t xml:space="preserve">    {</w:t>
       </w:r>
     </w:p>
     <w:p>
       <w:pPr>
-        <w:spacing w:line="240" w:lineRule="auto"/>
-      </w:pPr>
-      <w:r>
-        <w:rPr>
-          <w:i/>
-          <w:sz w:val="24"/>
-        </w:rPr>
+        <w:pStyle w:val="Listing"/>
+      </w:pPr>
+      <w:r>
         <w:t xml:space="preserve">        _globalEvent += OnEvent;</w:t>
       </w:r>
     </w:p>
     <w:p>
       <w:pPr>
-        <w:spacing w:line="240" w:lineRule="auto"/>
-      </w:pPr>
-      <w:r>
-        <w:rPr>
-          <w:i/>
-          <w:sz w:val="24"/>
-        </w:rPr>
+        <w:pStyle w:val="Listing"/>
+      </w:pPr>
+      <w:r>
         <w:t xml:space="preserve">        _cache.Add(_stream);</w:t>
       </w:r>
     </w:p>
     <w:p>
       <w:pPr>
-        <w:spacing w:line="240" w:lineRule="auto"/>
-      </w:pPr>
-      <w:r>
-        <w:rPr>
-          <w:i/>
-          <w:sz w:val="24"/>
-        </w:rPr>
+        <w:pStyle w:val="Listing"/>
+      </w:pPr>
+      <w:r>
         <w:t xml:space="preserve">    }</w:t>
       </w:r>
     </w:p>
     <w:p>
       <w:pPr>
-        <w:spacing w:line="240" w:lineRule="auto"/>
-      </w:pPr>
-    </w:p>
-    <w:p>
-      <w:pPr>
-        <w:spacing w:line="240" w:lineRule="auto"/>
-      </w:pPr>
-      <w:r>
-        <w:rPr>
-          <w:i/>
-          <w:sz w:val="24"/>
-        </w:rPr>
+        <w:pStyle w:val="Listing"/>
+      </w:pPr>
+    </w:p>
+    <w:p>
+      <w:pPr>
+        <w:pStyle w:val="Listing"/>
+      </w:pPr>
+      <w:r>
         <w:t xml:space="preserve">    private void OnEvent(object? sender, EventArgs e)</w:t>
       </w:r>
     </w:p>
     <w:p>
       <w:pPr>
-        <w:spacing w:line="240" w:lineRule="auto"/>
-      </w:pPr>
-      <w:r>
-        <w:rPr>
-          <w:i/>
-          <w:sz w:val="24"/>
-        </w:rPr>
+        <w:pStyle w:val="Listing"/>
+      </w:pPr>
+      <w:r>
         <w:t xml:space="preserve">    {</w:t>
       </w:r>
     </w:p>
     <w:p>
       <w:pPr>
-        <w:spacing w:line="240" w:lineRule="auto"/>
-      </w:pPr>
-      <w:r>
-        <w:rPr>
-          <w:i/>
-          <w:sz w:val="24"/>
-        </w:rPr>
+        <w:pStyle w:val="Listing"/>
+      </w:pPr>
+      <w:r>
         <w:t xml:space="preserve">        var temp = new byte[1024 * 100];</w:t>
       </w:r>
     </w:p>
     <w:p>
       <w:pPr>
-        <w:spacing w:line="240" w:lineRule="auto"/>
-      </w:pPr>
-      <w:r>
-        <w:rPr>
-          <w:i/>
-          <w:sz w:val="24"/>
-        </w:rPr>
+        <w:pStyle w:val="Listing"/>
+      </w:pPr>
+      <w:r>
         <w:t xml:space="preserve">    }</w:t>
       </w:r>
     </w:p>
     <w:p>
       <w:pPr>
-        <w:spacing w:line="240" w:lineRule="auto"/>
-      </w:pPr>
-    </w:p>
-    <w:p>
-      <w:pPr>
-        <w:spacing w:line="240" w:lineRule="auto"/>
-      </w:pPr>
-      <w:r>
-        <w:rPr>
-          <w:i/>
-          <w:sz w:val="24"/>
-        </w:rPr>
+        <w:pStyle w:val="Listing"/>
+      </w:pPr>
+    </w:p>
+    <w:p>
+      <w:pPr>
+        <w:pStyle w:val="Listing"/>
+      </w:pPr>
+      <w:r>
         <w:t xml:space="preserve">    public void Dispose()</w:t>
       </w:r>
     </w:p>
     <w:p>
       <w:pPr>
-        <w:spacing w:line="240" w:lineRule="auto"/>
-      </w:pPr>
-      <w:r>
-        <w:rPr>
-          <w:i/>
-          <w:sz w:val="24"/>
-        </w:rPr>
+        <w:pStyle w:val="Listing"/>
+      </w:pPr>
+      <w:r>
         <w:t xml:space="preserve">    {</w:t>
       </w:r>
     </w:p>
     <w:p>
       <w:pPr>
-        <w:spacing w:line="240" w:lineRule="auto"/>
-      </w:pPr>
-      <w:r>
-        <w:rPr>
-          <w:i/>
-          <w:sz w:val="24"/>
-        </w:rPr>
+        <w:pStyle w:val="Listing"/>
+      </w:pPr>
+      <w:r>
         <w:t xml:space="preserve">        _globalEvent -= OnEvent;   // отписка от события</w:t>
       </w:r>
     </w:p>
     <w:p>
       <w:pPr>
-        <w:spacing w:line="240" w:lineRule="auto"/>
-      </w:pPr>
-      <w:r>
-        <w:rPr>
-          <w:i/>
-          <w:sz w:val="24"/>
-        </w:rPr>
+        <w:pStyle w:val="Listing"/>
+      </w:pPr>
+      <w:r>
         <w:t xml:space="preserve">        _cache.Remove(_stream);    // удаление из статического кэша</w:t>
       </w:r>
     </w:p>
     <w:p>
       <w:pPr>
-        <w:spacing w:line="240" w:lineRule="auto"/>
-      </w:pPr>
-      <w:r>
-        <w:rPr>
-          <w:i/>
-          <w:sz w:val="24"/>
-        </w:rPr>
-        <w:t xml:space="preserve">        _stream.Dispose</w:t>
-      </w:r>
-      <w:r>
-        <w:rPr>
-          <w:i/>
-          <w:sz w:val="24"/>
-        </w:rPr>
-        <w:t>();         // освобождение потока</w:t>
-      </w:r>
-    </w:p>
-    <w:p>
-      <w:pPr>
-        <w:spacing w:line="240" w:lineRule="auto"/>
-      </w:pPr>
-      <w:r>
-        <w:rPr>
-          <w:i/>
-          <w:sz w:val="24"/>
-        </w:rPr>
+        <w:pStyle w:val="Listing"/>
+      </w:pPr>
+      <w:r>
+        <w:t xml:space="preserve">        _stream.Dispose();         // освобождение потока</w:t>
+      </w:r>
+    </w:p>
+    <w:p>
+      <w:pPr>
+        <w:pStyle w:val="Listing"/>
+      </w:pPr>
+      <w:r>
         <w:t xml:space="preserve">        _data = null;</w:t>
       </w:r>
     </w:p>
     <w:p>
       <w:pPr>
-        <w:spacing w:line="240" w:lineRule="auto"/>
-      </w:pPr>
-      <w:r>
-        <w:rPr>
-          <w:i/>
-          <w:sz w:val="24"/>
-        </w:rPr>
+        <w:pStyle w:val="Listing"/>
+      </w:pPr>
+      <w:r>
         <w:t xml:space="preserve">    }</w:t>
       </w:r>
     </w:p>
     <w:p>
       <w:pPr>
-        <w:spacing w:line="240" w:lineRule="auto"/>
-      </w:pPr>
-    </w:p>
-    <w:p>
-      <w:pPr>
-        <w:spacing w:line="240" w:lineRule="auto"/>
-      </w:pPr>
-      <w:r>
-        <w:rPr>
-          <w:i/>
-          <w:sz w:val="24"/>
-        </w:rPr>
+        <w:pStyle w:val="Listing"/>
+      </w:pPr>
+    </w:p>
+    <w:p>
+      <w:pPr>
+        <w:pStyle w:val="Listing"/>
+      </w:pPr>
+      <w:r>
         <w:t xml:space="preserve">    public static int CacheCount =&gt; _cache.Count;</w:t>
       </w:r>
     </w:p>
     <w:p>
       <w:pPr>
-        <w:spacing w:line="240" w:lineRule="auto"/>
-      </w:pPr>
-      <w:r>
-        <w:rPr>
-          <w:i/>
-          <w:sz w:val="24"/>
-        </w:rPr>
+        <w:pStyle w:val="Listing"/>
+      </w:pPr>
+      <w:r>
         <w:t>}</w:t>
       </w:r>
     </w:p>
@@ -4276,7 +3924,7 @@
           <w:noProof/>
         </w:rPr>
         <w:drawing>
-          <wp:inline distT="0" distB="0" distL="0" distR="0" wp14:anchorId="34002ABD" wp14:editId="05745ADF">
+          <wp:inline distT="0" distB="0" distL="0" distR="0" wp14:anchorId="22483031" wp14:editId="466D97D3">
             <wp:extent cx="5580000" cy="1646913"/>
             <wp:effectExtent l="0" t="0" r="0" b="0"/>
             <wp:docPr id="6" name="Picture 6"/>
@@ -4364,7 +4012,7 @@
         <w:spacing w:before="360"/>
         <w:ind w:firstLine="709"/>
       </w:pPr>
-      <w:bookmarkStart w:id="9" w:name="_Toc242378560"/>
+      <w:bookmarkStart w:id="9" w:name="_Toc242385944"/>
       <w:r>
         <w:rPr>
           <w:rFonts w:ascii="Times New Roman" w:hAnsi="Times New Roman"/>
@@ -4482,8 +4130,8 @@
           <w:noProof/>
         </w:rPr>
         <w:drawing>
-          <wp:inline distT="0" distB="0" distL="0" distR="0" wp14:anchorId="5BCED80E" wp14:editId="29437006">
-            <wp:extent cx="5580000" cy="2310316"/>
+          <wp:inline distT="0" distB="0" distL="0" distR="0" wp14:anchorId="75665330" wp14:editId="71925AF6">
+            <wp:extent cx="5580000" cy="2687068"/>
             <wp:effectExtent l="0" t="0" r="0" b="0"/>
             <wp:docPr id="7" name="Picture 7"/>
             <wp:cNvGraphicFramePr>
@@ -4505,7 +4153,7 @@
                   <pic:spPr>
                     <a:xfrm>
                       <a:off x="0" y="0"/>
-                      <a:ext cx="5580000" cy="2310316"/>
+                      <a:ext cx="5580000" cy="2687068"/>
                     </a:xfrm>
                     <a:prstGeom prst="rect">
                       <a:avLst/>
@@ -4624,290 +4272,194 @@
     </w:p>
     <w:p>
       <w:pPr>
-        <w:spacing w:line="240" w:lineRule="auto"/>
-      </w:pPr>
-      <w:r>
-        <w:rPr>
-          <w:i/>
-          <w:sz w:val="24"/>
-        </w:rPr>
+        <w:pStyle w:val="Listing"/>
+      </w:pPr>
+      <w:r>
         <w:t>// Шаг 3: разбор даты (тяжелый). Дата находится в первой части строки после "USERnn:"</w:t>
       </w:r>
     </w:p>
     <w:p>
       <w:pPr>
-        <w:spacing w:line="240" w:lineRule="auto"/>
-      </w:pPr>
-      <w:r>
-        <w:rPr>
-          <w:i/>
-          <w:sz w:val="24"/>
-        </w:rPr>
+        <w:pStyle w:val="Listing"/>
+      </w:pPr>
+      <w:r>
         <w:t>string dateText = parts[0].Substring(parts[0].IndexOf(':') + 1).Trim();</w:t>
       </w:r>
     </w:p>
     <w:p>
       <w:pPr>
-        <w:spacing w:line="240" w:lineRule="auto"/>
-      </w:pPr>
-      <w:r>
-        <w:rPr>
-          <w:i/>
-          <w:sz w:val="24"/>
-        </w:rPr>
+        <w:pStyle w:val="Listing"/>
+      </w:pPr>
+      <w:r>
         <w:t>var dateSw = Stopwatch.StartNew();</w:t>
       </w:r>
     </w:p>
     <w:p>
       <w:pPr>
-        <w:spacing w:line="240" w:lineRule="auto"/>
-      </w:pPr>
-      <w:r>
-        <w:rPr>
-          <w:i/>
-          <w:sz w:val="24"/>
-        </w:rPr>
+        <w:pStyle w:val="Listing"/>
+      </w:pPr>
+      <w:r>
         <w:t>DateTime logDate = default;</w:t>
       </w:r>
     </w:p>
     <w:p>
       <w:pPr>
-        <w:spacing w:line="240" w:lineRule="auto"/>
-      </w:pPr>
-      <w:r>
-        <w:rPr>
-          <w:i/>
-          <w:sz w:val="24"/>
-        </w:rPr>
+        <w:pStyle w:val="Listing"/>
+      </w:pPr>
+      <w:r>
         <w:t>bool dateOk;</w:t>
       </w:r>
     </w:p>
     <w:p>
       <w:pPr>
-        <w:spacing w:line="240" w:lineRule="auto"/>
-      </w:pPr>
-      <w:r>
-        <w:rPr>
-          <w:i/>
-          <w:sz w:val="24"/>
-        </w:rPr>
+        <w:pStyle w:val="Listing"/>
+      </w:pPr>
+      <w:r>
         <w:t>if (_parseExact)</w:t>
       </w:r>
     </w:p>
     <w:p>
       <w:pPr>
-        <w:spacing w:line="240" w:lineRule="auto"/>
-      </w:pPr>
-      <w:r>
-        <w:rPr>
-          <w:i/>
-          <w:sz w:val="24"/>
-        </w:rPr>
+        <w:pStyle w:val="Listing"/>
+      </w:pPr>
+      <w:r>
         <w:t>{</w:t>
       </w:r>
     </w:p>
     <w:p>
       <w:pPr>
-        <w:spacing w:line="240" w:lineRule="auto"/>
-      </w:pPr>
-      <w:r>
-        <w:rPr>
-          <w:i/>
-          <w:sz w:val="24"/>
-        </w:rPr>
+        <w:pStyle w:val="Listing"/>
+      </w:pPr>
+      <w:r>
+        <w:lastRenderedPageBreak/>
         <w:t xml:space="preserve">    // Задание 2: DateTime.ParseExact с фиксированным форматом</w:t>
       </w:r>
     </w:p>
     <w:p>
       <w:pPr>
-        <w:spacing w:line="240" w:lineRule="auto"/>
-      </w:pPr>
-      <w:r>
-        <w:rPr>
-          <w:i/>
-          <w:sz w:val="24"/>
-        </w:rPr>
+        <w:pStyle w:val="Listing"/>
+      </w:pPr>
+      <w:r>
         <w:t xml:space="preserve">    try</w:t>
       </w:r>
     </w:p>
     <w:p>
       <w:pPr>
-        <w:spacing w:line="240" w:lineRule="auto"/>
-      </w:pPr>
-      <w:r>
-        <w:rPr>
-          <w:i/>
-          <w:sz w:val="24"/>
-        </w:rPr>
-        <w:lastRenderedPageBreak/>
+        <w:pStyle w:val="Listing"/>
+      </w:pPr>
+      <w:r>
         <w:t xml:space="preserve">    {</w:t>
       </w:r>
     </w:p>
     <w:p>
       <w:pPr>
-        <w:spacing w:line="240" w:lineRule="auto"/>
-      </w:pPr>
-      <w:r>
-        <w:rPr>
-          <w:i/>
-          <w:sz w:val="24"/>
-        </w:rPr>
+        <w:pStyle w:val="Listing"/>
+      </w:pPr>
+      <w:r>
         <w:t xml:space="preserve">        logDate = DateTime.ParseExact(dateText, "yyyy-MM-dd HH:mm:ss.fff", CultureInfo.InvariantCulture);</w:t>
       </w:r>
     </w:p>
     <w:p>
       <w:pPr>
-        <w:spacing w:line="240" w:lineRule="auto"/>
-      </w:pPr>
-      <w:r>
-        <w:rPr>
-          <w:i/>
-          <w:sz w:val="24"/>
-        </w:rPr>
+        <w:pStyle w:val="Listing"/>
+      </w:pPr>
+      <w:r>
         <w:t xml:space="preserve">        dateOk = true;</w:t>
       </w:r>
     </w:p>
     <w:p>
       <w:pPr>
-        <w:spacing w:line="240" w:lineRule="auto"/>
-      </w:pPr>
-      <w:r>
-        <w:rPr>
-          <w:i/>
-          <w:sz w:val="24"/>
-        </w:rPr>
+        <w:pStyle w:val="Listing"/>
+      </w:pPr>
+      <w:r>
         <w:t xml:space="preserve">    }</w:t>
       </w:r>
     </w:p>
     <w:p>
       <w:pPr>
-        <w:spacing w:line="240" w:lineRule="auto"/>
-      </w:pPr>
-      <w:r>
-        <w:rPr>
-          <w:i/>
-          <w:sz w:val="24"/>
-        </w:rPr>
+        <w:pStyle w:val="Listing"/>
+      </w:pPr>
+      <w:r>
         <w:t xml:space="preserve">    catch (FormatException)</w:t>
       </w:r>
     </w:p>
     <w:p>
       <w:pPr>
-        <w:spacing w:line="240" w:lineRule="auto"/>
-      </w:pPr>
-      <w:r>
-        <w:rPr>
-          <w:i/>
-          <w:sz w:val="24"/>
-        </w:rPr>
+        <w:pStyle w:val="Listing"/>
+      </w:pPr>
+      <w:r>
         <w:t xml:space="preserve">    {</w:t>
       </w:r>
     </w:p>
     <w:p>
       <w:pPr>
-        <w:spacing w:line="240" w:lineRule="auto"/>
-      </w:pPr>
-      <w:r>
-        <w:rPr>
-          <w:i/>
-          <w:sz w:val="24"/>
-        </w:rPr>
+        <w:pStyle w:val="Listing"/>
+      </w:pPr>
+      <w:r>
         <w:t xml:space="preserve">        dateOk = false;</w:t>
       </w:r>
     </w:p>
     <w:p>
       <w:pPr>
-        <w:spacing w:line="240" w:lineRule="auto"/>
-      </w:pPr>
-      <w:r>
-        <w:rPr>
-          <w:i/>
-          <w:sz w:val="24"/>
-        </w:rPr>
+        <w:pStyle w:val="Listing"/>
+      </w:pPr>
+      <w:r>
         <w:t xml:space="preserve">    }</w:t>
       </w:r>
     </w:p>
     <w:p>
       <w:pPr>
-        <w:spacing w:line="240" w:lineRule="auto"/>
-      </w:pPr>
-      <w:r>
-        <w:rPr>
-          <w:i/>
-          <w:sz w:val="24"/>
-        </w:rPr>
+        <w:pStyle w:val="Listing"/>
+      </w:pPr>
+      <w:r>
         <w:t>}</w:t>
       </w:r>
     </w:p>
     <w:p>
       <w:pPr>
-        <w:spacing w:line="240" w:lineRule="auto"/>
-      </w:pPr>
-      <w:r>
-        <w:rPr>
-          <w:i/>
-          <w:sz w:val="24"/>
-        </w:rPr>
+        <w:pStyle w:val="Listing"/>
+      </w:pPr>
+      <w:r>
         <w:t>else</w:t>
       </w:r>
     </w:p>
     <w:p>
       <w:pPr>
-        <w:spacing w:line="240" w:lineRule="auto"/>
-      </w:pPr>
-      <w:r>
-        <w:rPr>
-          <w:i/>
-          <w:sz w:val="24"/>
-        </w:rPr>
+        <w:pStyle w:val="Listing"/>
+      </w:pPr>
+      <w:r>
         <w:t>{</w:t>
       </w:r>
     </w:p>
     <w:p>
       <w:pPr>
-        <w:spacing w:line="240" w:lineRule="auto"/>
-      </w:pPr>
-      <w:r>
-        <w:rPr>
-          <w:i/>
-          <w:sz w:val="24"/>
-        </w:rPr>
+        <w:pStyle w:val="Listing"/>
+      </w:pPr>
+      <w:r>
         <w:t xml:space="preserve">    dateOk = DateTime.TryParse(dateText, out logDate);</w:t>
       </w:r>
     </w:p>
     <w:p>
       <w:pPr>
-        <w:spacing w:line="240" w:lineRule="auto"/>
-      </w:pPr>
-      <w:r>
-        <w:rPr>
-          <w:i/>
-          <w:sz w:val="24"/>
-        </w:rPr>
+        <w:pStyle w:val="Listing"/>
+      </w:pPr>
+      <w:r>
         <w:t>}</w:t>
       </w:r>
     </w:p>
     <w:p>
       <w:pPr>
-        <w:spacing w:line="240" w:lineRule="auto"/>
-      </w:pPr>
-      <w:r>
-        <w:rPr>
-          <w:i/>
-          <w:sz w:val="24"/>
-        </w:rPr>
+        <w:pStyle w:val="Listing"/>
+      </w:pPr>
+      <w:r>
         <w:t>dateSw.Stop();</w:t>
       </w:r>
     </w:p>
     <w:p>
       <w:pPr>
-        <w:spacing w:line="240" w:lineRule="auto"/>
-      </w:pPr>
-      <w:r>
-        <w:rPr>
-          <w:i/>
-          <w:sz w:val="24"/>
-        </w:rPr>
+        <w:pStyle w:val="Listing"/>
+      </w:pPr>
+      <w:r>
         <w:t>AddCall(_parseExact ? "IsAnomaly.DateTime.ParseExact" : "IsAnomaly.DateTime.TryParse", dateSw.Elapsed.TotalMilliseconds);</w:t>
       </w:r>
     </w:p>
@@ -4941,7 +4493,7 @@
           <w:noProof/>
         </w:rPr>
         <w:drawing>
-          <wp:inline distT="0" distB="0" distL="0" distR="0" wp14:anchorId="1B2D4EFA" wp14:editId="343B9A86">
+          <wp:inline distT="0" distB="0" distL="0" distR="0" wp14:anchorId="16B87965" wp14:editId="3E15CC11">
             <wp:extent cx="5580000" cy="2310316"/>
             <wp:effectExtent l="0" t="0" r="0" b="0"/>
             <wp:docPr id="8" name="Picture 8"/>
@@ -5011,7 +4563,7 @@
         <w:jc w:val="both"/>
       </w:pPr>
       <w:r>
-        <w:t xml:space="preserve">Общее время выполнения составило 39 мс. На </w:t>
+        <w:t xml:space="preserve">Общее время выполнения составило 41 мс. На </w:t>
       </w:r>
       <w:r>
         <w:rPr>
@@ -5020,7 +4572,7 @@
         <w:t>GenerateData</w:t>
       </w:r>
       <w:r>
-        <w:t xml:space="preserve"> приходится 24,6 мс (62 %), на </w:t>
+        <w:t xml:space="preserve"> приходится 27,2 мс (66 %), на </w:t>
       </w:r>
       <w:r>
         <w:rPr>
@@ -5029,7 +4581,7 @@
         <w:t>ProcessLogs</w:t>
       </w:r>
       <w:r>
-        <w:t xml:space="preserve"> – 14,9 мс, из которых 14,3 мс занимает </w:t>
+        <w:t xml:space="preserve"> – 13,9 мс, из которых 13,2 мс занимает </w:t>
       </w:r>
       <w:r>
         <w:rPr>
@@ -5062,8 +4614,8 @@
         </w:rPr>
         <w:lastRenderedPageBreak/>
         <w:drawing>
-          <wp:inline distT="0" distB="0" distL="0" distR="0" wp14:anchorId="6DA3C804" wp14:editId="3F3D2A47">
-            <wp:extent cx="5580000" cy="2192842"/>
+          <wp:inline distT="0" distB="0" distL="0" distR="0" wp14:anchorId="654280BD" wp14:editId="4351C753">
+            <wp:extent cx="5580000" cy="2310316"/>
             <wp:effectExtent l="0" t="0" r="0" b="0"/>
             <wp:docPr id="9" name="Picture 9"/>
             <wp:cNvGraphicFramePr>
@@ -5085,7 +4637,7 @@
                   <pic:spPr>
                     <a:xfrm>
                       <a:off x="0" y="0"/>
-                      <a:ext cx="5580000" cy="2192842"/>
+                      <a:ext cx="5580000" cy="2310316"/>
                     </a:xfrm>
                     <a:prstGeom prst="rect">
                       <a:avLst/>
@@ -5343,7 +4895,7 @@
               <w:rPr>
                 <w:sz w:val="24"/>
               </w:rPr>
-              <w:t>24,6</w:t>
+              <w:t>27,2</w:t>
             </w:r>
           </w:p>
         </w:tc>
@@ -5360,7 +4912,7 @@
               <w:rPr>
                 <w:sz w:val="24"/>
               </w:rPr>
-              <w:t>62,2</w:t>
+              <w:t>66,1</w:t>
             </w:r>
           </w:p>
         </w:tc>
@@ -5429,7 +4981,7 @@
               <w:rPr>
                 <w:sz w:val="24"/>
               </w:rPr>
-              <w:t>4,1</w:t>
+              <w:t>2,9</w:t>
             </w:r>
           </w:p>
         </w:tc>
@@ -5445,7 +4997,7 @@
               <w:rPr>
                 <w:sz w:val="24"/>
               </w:rPr>
-              <w:t>28,8</w:t>
+              <w:t>21,9</w:t>
             </w:r>
           </w:p>
         </w:tc>
@@ -5500,7 +5052,7 @@
               <w:rPr>
                 <w:sz w:val="24"/>
               </w:rPr>
-              <w:t>2,8</w:t>
+              <w:t>2,5</w:t>
             </w:r>
           </w:p>
         </w:tc>
@@ -5516,7 +5068,7 @@
               <w:rPr>
                 <w:sz w:val="24"/>
               </w:rPr>
-              <w:t>19,5</w:t>
+              <w:t>19,1</w:t>
             </w:r>
           </w:p>
         </w:tc>
@@ -5571,7 +5123,7 @@
               <w:rPr>
                 <w:sz w:val="24"/>
               </w:rPr>
-              <w:t>1,6</w:t>
+              <w:t>1,4</w:t>
             </w:r>
           </w:p>
         </w:tc>
@@ -5587,7 +5139,7 @@
               <w:rPr>
                 <w:sz w:val="24"/>
               </w:rPr>
-              <w:t>11,3</w:t>
+              <w:t>10,8</w:t>
             </w:r>
           </w:p>
         </w:tc>
@@ -5642,7 +5194,7 @@
               <w:rPr>
                 <w:sz w:val="24"/>
               </w:rPr>
-              <w:t>1,0</w:t>
+              <w:t>0,9</w:t>
             </w:r>
           </w:p>
         </w:tc>
@@ -5658,7 +5210,7 @@
               <w:rPr>
                 <w:sz w:val="24"/>
               </w:rPr>
-              <w:t>6,8</w:t>
+              <w:t>7,1</w:t>
             </w:r>
           </w:p>
         </w:tc>
@@ -5747,7 +5299,7 @@
         </w:rPr>
         <w:lastRenderedPageBreak/>
         <w:drawing>
-          <wp:inline distT="0" distB="0" distL="0" distR="0" wp14:anchorId="288BC421" wp14:editId="14EFF3C4">
+          <wp:inline distT="0" distB="0" distL="0" distR="0" wp14:anchorId="33588DE0" wp14:editId="6747923B">
             <wp:extent cx="5580000" cy="2310316"/>
             <wp:effectExtent l="0" t="0" r="0" b="0"/>
             <wp:docPr id="10" name="Picture 10"/>
@@ -5817,7 +5369,7 @@
         <w:jc w:val="both"/>
       </w:pPr>
       <w:r>
-        <w:t xml:space="preserve">Общее время составило 43 мс, из них </w:t>
+        <w:t xml:space="preserve">Общее время составило 48 мс, из них </w:t>
       </w:r>
       <w:r>
         <w:rPr>
@@ -5826,7 +5378,7 @@
         <w:t>IsAnomaly</w:t>
       </w:r>
       <w:r>
-        <w:t xml:space="preserve"> занимает 18,3 мс. Разбор даты </w:t>
+        <w:t xml:space="preserve"> занимает 23,5 мс. Разбор даты </w:t>
       </w:r>
       <w:r>
         <w:rPr>
@@ -5835,7 +5387,7 @@
         <w:t>ParseExact</w:t>
       </w:r>
       <w:r>
-        <w:t xml:space="preserve"> занял 5,8 мс (31,9 %), </w:t>
+        <w:t xml:space="preserve"> занял 7,1 мс (30,4 %), </w:t>
       </w:r>
       <w:r>
         <w:rPr>
@@ -5844,7 +5396,7 @@
         <w:t>Regex</w:t>
       </w:r>
       <w:r>
-        <w:t xml:space="preserve"> – 4,7 мс (25,9 %).</w:t>
+        <w:t xml:space="preserve"> – 6,3 мс (27,0 %).</w:t>
       </w:r>
     </w:p>
     <w:p>
@@ -5867,7 +5419,7 @@
           <w:noProof/>
         </w:rPr>
         <w:drawing>
-          <wp:inline distT="0" distB="0" distL="0" distR="0" wp14:anchorId="54676E82" wp14:editId="1F0755EF">
+          <wp:inline distT="0" distB="0" distL="0" distR="0" wp14:anchorId="3FC1C2B1" wp14:editId="0756D14D">
             <wp:extent cx="5580000" cy="2192842"/>
             <wp:effectExtent l="0" t="0" r="0" b="0"/>
             <wp:docPr id="11" name="Picture 11"/>
@@ -5955,7 +5507,7 @@
         <w:t>TryParse</w:t>
       </w:r>
       <w:r>
-        <w:t xml:space="preserve"> (5,8 мс против 2,8 мс), то есть заметного выигрыша от замены нет. </w:t>
+        <w:t xml:space="preserve"> (7,1 мс против 2,5 мс), то есть заметного выигрыша от замены нет. </w:t>
       </w:r>
       <w:r>
         <w:rPr>
@@ -5973,7 +5525,7 @@
         <w:spacing w:before="360"/>
         <w:ind w:firstLine="709"/>
       </w:pPr>
-      <w:bookmarkStart w:id="10" w:name="_Toc242378561"/>
+      <w:bookmarkStart w:id="10" w:name="_Toc242385945"/>
       <w:r>
         <w:rPr>
           <w:rFonts w:ascii="Times New Roman" w:hAnsi="Times New Roman"/>
@@ -6022,234 +5574,158 @@
     </w:p>
     <w:p>
       <w:pPr>
-        <w:spacing w:line="240" w:lineRule="auto"/>
-      </w:pPr>
-      <w:r>
-        <w:rPr>
-          <w:i/>
-          <w:sz w:val="24"/>
-        </w:rPr>
+        <w:pStyle w:val="Listing"/>
+      </w:pPr>
+      <w:r>
         <w:t>// Конкатенация строк в цикле: каждый раз создаётся новая строка</w:t>
       </w:r>
     </w:p>
     <w:p>
       <w:pPr>
-        <w:spacing w:line="240" w:lineRule="auto"/>
-      </w:pPr>
-      <w:r>
-        <w:rPr>
-          <w:i/>
-          <w:sz w:val="24"/>
-        </w:rPr>
+        <w:pStyle w:val="Listing"/>
+      </w:pPr>
+      <w:r>
         <w:t>private static string BuildTextWithConcat(int count)</w:t>
       </w:r>
     </w:p>
     <w:p>
       <w:pPr>
-        <w:spacing w:line="240" w:lineRule="auto"/>
-      </w:pPr>
-      <w:r>
-        <w:rPr>
-          <w:i/>
-          <w:sz w:val="24"/>
-        </w:rPr>
+        <w:pStyle w:val="Listing"/>
+      </w:pPr>
+      <w:r>
         <w:t>{</w:t>
       </w:r>
     </w:p>
     <w:p>
       <w:pPr>
-        <w:spacing w:line="240" w:lineRule="auto"/>
-      </w:pPr>
-      <w:r>
-        <w:rPr>
-          <w:i/>
-          <w:sz w:val="24"/>
-        </w:rPr>
+        <w:pStyle w:val="Listing"/>
+      </w:pPr>
+      <w:r>
         <w:t xml:space="preserve">    var sw = Stopwatch.StartNew();</w:t>
       </w:r>
     </w:p>
     <w:p>
       <w:pPr>
-        <w:spacing w:line="240" w:lineRule="auto"/>
-      </w:pPr>
-      <w:r>
-        <w:rPr>
-          <w:i/>
-          <w:sz w:val="24"/>
-        </w:rPr>
+        <w:pStyle w:val="Listing"/>
+      </w:pPr>
+      <w:r>
         <w:t xml:space="preserve">    string result = "";</w:t>
       </w:r>
     </w:p>
     <w:p>
       <w:pPr>
-        <w:spacing w:line="240" w:lineRule="auto"/>
-      </w:pPr>
-      <w:r>
-        <w:rPr>
-          <w:i/>
-          <w:sz w:val="24"/>
-        </w:rPr>
+        <w:pStyle w:val="Listing"/>
+      </w:pPr>
+      <w:r>
         <w:t xml:space="preserve">    for (int i = 0; i &lt; count; i++)</w:t>
       </w:r>
     </w:p>
     <w:p>
       <w:pPr>
-        <w:spacing w:line="240" w:lineRule="auto"/>
-      </w:pPr>
-      <w:r>
-        <w:rPr>
-          <w:i/>
-          <w:sz w:val="24"/>
-        </w:rPr>
+        <w:pStyle w:val="Listing"/>
+      </w:pPr>
+      <w:r>
         <w:t xml:space="preserve">        result += "слово ";</w:t>
       </w:r>
     </w:p>
     <w:p>
       <w:pPr>
-        <w:spacing w:line="240" w:lineRule="auto"/>
-      </w:pPr>
-      <w:r>
-        <w:rPr>
-          <w:i/>
-          <w:sz w:val="24"/>
-        </w:rPr>
+        <w:pStyle w:val="Listing"/>
+      </w:pPr>
+      <w:r>
         <w:t xml:space="preserve">    Add("BuildTextWithConcat", sw);</w:t>
       </w:r>
     </w:p>
     <w:p>
       <w:pPr>
-        <w:spacing w:line="240" w:lineRule="auto"/>
-      </w:pPr>
-      <w:r>
-        <w:rPr>
-          <w:i/>
-          <w:sz w:val="24"/>
-        </w:rPr>
+        <w:pStyle w:val="Listing"/>
+      </w:pPr>
+      <w:r>
         <w:t xml:space="preserve">    return result;</w:t>
       </w:r>
     </w:p>
     <w:p>
       <w:pPr>
-        <w:spacing w:line="240" w:lineRule="auto"/>
-      </w:pPr>
-      <w:r>
-        <w:rPr>
-          <w:i/>
-          <w:sz w:val="24"/>
-        </w:rPr>
+        <w:pStyle w:val="Listing"/>
+      </w:pPr>
+      <w:r>
         <w:t>}</w:t>
       </w:r>
     </w:p>
     <w:p>
       <w:pPr>
-        <w:spacing w:line="240" w:lineRule="auto"/>
-      </w:pPr>
-    </w:p>
-    <w:p>
-      <w:pPr>
-        <w:spacing w:line="240" w:lineRule="auto"/>
-      </w:pPr>
-      <w:r>
-        <w:rPr>
-          <w:i/>
-          <w:sz w:val="24"/>
-        </w:rPr>
+        <w:pStyle w:val="Listing"/>
+      </w:pPr>
+    </w:p>
+    <w:p>
+      <w:pPr>
+        <w:pStyle w:val="Listing"/>
+      </w:pPr>
+      <w:r>
         <w:t>private static string BuildTextWithBuilder(int count)</w:t>
       </w:r>
     </w:p>
     <w:p>
       <w:pPr>
-        <w:spacing w:line="240" w:lineRule="auto"/>
-      </w:pPr>
-      <w:r>
-        <w:rPr>
-          <w:i/>
-          <w:sz w:val="24"/>
-        </w:rPr>
+        <w:pStyle w:val="Listing"/>
+      </w:pPr>
+      <w:r>
         <w:t>{</w:t>
       </w:r>
     </w:p>
     <w:p>
       <w:pPr>
-        <w:spacing w:line="240" w:lineRule="auto"/>
-      </w:pPr>
-      <w:r>
-        <w:rPr>
-          <w:i/>
-          <w:sz w:val="24"/>
-        </w:rPr>
+        <w:pStyle w:val="Listing"/>
+      </w:pPr>
+      <w:r>
         <w:t xml:space="preserve">    var sw = Stopwatch.StartNew();</w:t>
       </w:r>
     </w:p>
     <w:p>
       <w:pPr>
-        <w:spacing w:line="240" w:lineRule="auto"/>
-      </w:pPr>
-      <w:r>
-        <w:rPr>
-          <w:i/>
-          <w:sz w:val="24"/>
-        </w:rPr>
+        <w:pStyle w:val="Listing"/>
+      </w:pPr>
+      <w:r>
         <w:t xml:space="preserve">    var sb = new StringBuilder();</w:t>
       </w:r>
     </w:p>
     <w:p>
       <w:pPr>
-        <w:spacing w:line="240" w:lineRule="auto"/>
-      </w:pPr>
-      <w:r>
-        <w:rPr>
-          <w:i/>
-          <w:sz w:val="24"/>
-        </w:rPr>
+        <w:pStyle w:val="Listing"/>
+      </w:pPr>
+      <w:r>
         <w:t xml:space="preserve">    for (int i = 0; i &lt; count; i++)</w:t>
       </w:r>
     </w:p>
     <w:p>
       <w:pPr>
-        <w:spacing w:line="240" w:lineRule="auto"/>
-      </w:pPr>
-      <w:r>
-        <w:rPr>
-          <w:i/>
-          <w:sz w:val="24"/>
-        </w:rPr>
+        <w:pStyle w:val="Listing"/>
+      </w:pPr>
+      <w:r>
         <w:t xml:space="preserve">        sb.Append("слово ");</w:t>
       </w:r>
     </w:p>
     <w:p>
       <w:pPr>
-        <w:spacing w:line="240" w:lineRule="auto"/>
-      </w:pPr>
-      <w:r>
-        <w:rPr>
-          <w:i/>
-          <w:sz w:val="24"/>
-        </w:rPr>
+        <w:pStyle w:val="Listing"/>
+      </w:pPr>
+      <w:r>
         <w:t xml:space="preserve">    Add("BuildTextWithBuilder", sw);</w:t>
       </w:r>
     </w:p>
     <w:p>
       <w:pPr>
-        <w:spacing w:line="240" w:lineRule="auto"/>
-      </w:pPr>
-      <w:r>
-        <w:rPr>
-          <w:i/>
-          <w:sz w:val="24"/>
-        </w:rPr>
+        <w:pStyle w:val="Listing"/>
+      </w:pPr>
+      <w:r>
         <w:t xml:space="preserve">    return sb.ToString();</w:t>
       </w:r>
     </w:p>
     <w:p>
       <w:pPr>
-        <w:spacing w:line="240" w:lineRule="auto"/>
-      </w:pPr>
-      <w:r>
-        <w:rPr>
-          <w:i/>
-          <w:sz w:val="24"/>
-        </w:rPr>
+        <w:pStyle w:val="Listing"/>
+      </w:pPr>
+      <w:r>
         <w:t>}</w:t>
       </w:r>
     </w:p>
@@ -6274,7 +5750,7 @@
           <w:noProof/>
         </w:rPr>
         <w:drawing>
-          <wp:inline distT="0" distB="0" distL="0" distR="0" wp14:anchorId="77786A18" wp14:editId="618B045E">
+          <wp:inline distT="0" distB="0" distL="0" distR="0" wp14:anchorId="28A83803" wp14:editId="5879980A">
             <wp:extent cx="5580000" cy="1776932"/>
             <wp:effectExtent l="0" t="0" r="0" b="0"/>
             <wp:docPr id="12" name="Picture 12"/>
@@ -6326,7 +5802,7 @@
         <w:jc w:val="both"/>
       </w:pPr>
       <w:r>
-        <w:t xml:space="preserve">Общее время составило 630 мс. Метод </w:t>
+        <w:t xml:space="preserve">Общее время составило 595 мс. Метод </w:t>
       </w:r>
       <w:r>
         <w:rPr>
@@ -6335,7 +5811,7 @@
         <w:t>BuildTextWithConcat</w:t>
       </w:r>
       <w:r>
-        <w:t xml:space="preserve"> занял 612,2 мс (97,2 %), тогда как </w:t>
+        <w:t xml:space="preserve"> занял 575,0 мс (96,6 %), тогда как </w:t>
       </w:r>
       <w:r>
         <w:rPr>
@@ -6344,7 +5820,7 @@
         <w:t>BuildTextWithBuilder</w:t>
       </w:r>
       <w:r>
-        <w:t xml:space="preserve"> – 0,6 мс. Причина в том, что при конкатенации строк в цикле на каждом шаге создается новая строка и копируется весь накопленный текст, поэтому затраты растут квадратично. Горячий путь собственного кода – метод конкатенации.</w:t>
+        <w:t xml:space="preserve"> – 0,8 мс. Причина в том, что при конкатенации строк в цикле на каждом шаге создается новая строка и копируется весь накопленный текст, поэтому затраты растут квадратично. Горячий путь собственного кода – метод конкатенации.</w:t>
       </w:r>
     </w:p>
     <w:p>
@@ -6357,7 +5833,7 @@
         <w:pStyle w:val="1"/>
         <w:ind w:firstLine="709"/>
       </w:pPr>
-      <w:bookmarkStart w:id="11" w:name="_Toc242378562"/>
+      <w:bookmarkStart w:id="11" w:name="_Toc242385946"/>
       <w:r>
         <w:rPr>
           <w:rFonts w:ascii="Times New Roman" w:hAnsi="Times New Roman"/>
@@ -6373,7 +5849,7 @@
         <w:spacing w:before="360"/>
         <w:ind w:firstLine="709"/>
       </w:pPr>
-      <w:bookmarkStart w:id="12" w:name="_Toc242378563"/>
+      <w:bookmarkStart w:id="12" w:name="_Toc242385947"/>
       <w:r>
         <w:rPr>
           <w:rFonts w:ascii="Times New Roman" w:hAnsi="Times New Roman"/>
@@ -6409,7 +5885,7 @@
         <w:spacing w:before="360"/>
         <w:ind w:firstLine="709"/>
       </w:pPr>
-      <w:bookmarkStart w:id="13" w:name="_Toc242378564"/>
+      <w:bookmarkStart w:id="13" w:name="_Toc242385948"/>
       <w:r>
         <w:rPr>
           <w:rFonts w:ascii="Times New Roman" w:hAnsi="Times New Roman"/>
@@ -6433,7 +5909,7 @@
         <w:spacing w:before="360"/>
         <w:ind w:firstLine="709"/>
       </w:pPr>
-      <w:bookmarkStart w:id="14" w:name="_Toc242378565"/>
+      <w:bookmarkStart w:id="14" w:name="_Toc242385949"/>
       <w:r>
         <w:rPr>
           <w:rFonts w:ascii="Times New Roman" w:hAnsi="Times New Roman"/>
@@ -6492,7 +5968,7 @@
         <w:spacing w:before="360"/>
         <w:ind w:firstLine="709"/>
       </w:pPr>
-      <w:bookmarkStart w:id="15" w:name="_Toc242378566"/>
+      <w:bookmarkStart w:id="15" w:name="_Toc242385950"/>
       <w:r>
         <w:rPr>
           <w:rFonts w:ascii="Times New Roman" w:hAnsi="Times New Roman"/>
@@ -6529,7 +6005,7 @@
         <w:pStyle w:val="1"/>
         <w:jc w:val="center"/>
       </w:pPr>
-      <w:bookmarkStart w:id="16" w:name="_Toc242378567"/>
+      <w:bookmarkStart w:id="16" w:name="_Toc242385951"/>
       <w:r>
         <w:rPr>
           <w:rFonts w:ascii="Times New Roman" w:hAnsi="Times New Roman"/>
@@ -6876,31 +6352,31 @@
       </w:rPr>
     </w:lvl>
   </w:abstractNum>
-  <w:num w:numId="1" w16cid:durableId="832575199">
+  <w:num w:numId="1" w16cid:durableId="1913276444">
     <w:abstractNumId w:val="8"/>
   </w:num>
-  <w:num w:numId="2" w16cid:durableId="1682508320">
+  <w:num w:numId="2" w16cid:durableId="2080322751">
     <w:abstractNumId w:val="6"/>
   </w:num>
-  <w:num w:numId="3" w16cid:durableId="1613895455">
+  <w:num w:numId="3" w16cid:durableId="775715557">
     <w:abstractNumId w:val="5"/>
   </w:num>
-  <w:num w:numId="4" w16cid:durableId="1135022989">
+  <w:num w:numId="4" w16cid:durableId="1848714438">
     <w:abstractNumId w:val="4"/>
   </w:num>
-  <w:num w:numId="5" w16cid:durableId="255526830">
+  <w:num w:numId="5" w16cid:durableId="1724526091">
     <w:abstractNumId w:val="7"/>
   </w:num>
-  <w:num w:numId="6" w16cid:durableId="1092706167">
+  <w:num w:numId="6" w16cid:durableId="301547874">
     <w:abstractNumId w:val="3"/>
   </w:num>
-  <w:num w:numId="7" w16cid:durableId="354385518">
+  <w:num w:numId="7" w16cid:durableId="781730386">
     <w:abstractNumId w:val="2"/>
   </w:num>
-  <w:num w:numId="8" w16cid:durableId="2066105983">
+  <w:num w:numId="8" w16cid:durableId="1700626137">
     <w:abstractNumId w:val="1"/>
   </w:num>
-  <w:num w:numId="9" w16cid:durableId="1580556933">
+  <w:num w:numId="9" w16cid:durableId="1540510054">
     <w:abstractNumId w:val="0"/>
   </w:num>
 </w:numbering>
@@ -18288,6 +17764,17 @@
       </w:tcPr>
     </w:tblStylePr>
   </w:style>
+  <w:style w:type="paragraph" w:customStyle="1" w:styleId="Listing">
+    <w:name w:val="Listing"/>
+    <w:basedOn w:val="a1"/>
+    <w:pPr>
+      <w:spacing w:line="240" w:lineRule="auto"/>
+    </w:pPr>
+    <w:rPr>
+      <w:i/>
+      <w:sz w:val="24"/>
+    </w:rPr>
+  </w:style>
   <w:style w:type="paragraph" w:styleId="14">
     <w:name w:val="toc 1"/>
     <w:basedOn w:val="a1"/>
@@ -18295,7 +17782,7 @@
     <w:autoRedefine/>
     <w:uiPriority w:val="39"/>
     <w:unhideWhenUsed/>
-    <w:rsid w:val="00996E0B"/>
+    <w:rsid w:val="00B24AC1"/>
     <w:pPr>
       <w:spacing w:after="100"/>
     </w:pPr>
@@ -18307,7 +17794,7 @@
     <w:autoRedefine/>
     <w:uiPriority w:val="39"/>
     <w:unhideWhenUsed/>
-    <w:rsid w:val="00996E0B"/>
+    <w:rsid w:val="00B24AC1"/>
     <w:pPr>
       <w:spacing w:after="100"/>
       <w:ind w:left="280"/>
@@ -18318,7 +17805,7 @@
     <w:basedOn w:val="a2"/>
     <w:uiPriority w:val="99"/>
     <w:unhideWhenUsed/>
-    <w:rsid w:val="00996E0B"/>
+    <w:rsid w:val="00B24AC1"/>
     <w:rPr>
       <w:color w:val="0000FF" w:themeColor="hyperlink"/>
       <w:u w:val="single"/>

</xml_diff>